<commit_message>
tex2docx: convert lesson-plan tables (ModhHead, Sayr rows) to Word; regenerate all lesson-plan .docx
The Word files only contained the cover: the session header and the
lesson table were dropped. Tables nested in a lesson cell become
pictures sized to the cell.

Co-Authored-By: Claude Opus 5.5 <noreply@anthropic.com>
Claude-Session: https://claude.ai/code/session_015WVgZKTbSWpZTjn6aZsqC9
</commit_message>
<xml_diff>
--- a/documents/1as/modhakirat/modhakira_01_1as.docx
+++ b/documents/1as/modhakirat/modhakira_01_1as.docx
@@ -2,94 +2,777 @@
 <file path=word/document.xml><?xml version="1.0" encoding="utf-8"?>
 <w:document xmlns:w="http://schemas.openxmlformats.org/wordprocessingml/2006/main" xmlns:m="http://schemas.openxmlformats.org/officeDocument/2006/math" xmlns:r="http://schemas.openxmlformats.org/officeDocument/2006/relationships" xmlns:o="urn:schemas-microsoft-com:office:office" xmlns:v="urn:schemas-microsoft-com:vml" xmlns:w10="urn:schemas-microsoft-com:office:word" xmlns:a="http://schemas.openxmlformats.org/drawingml/2006/main" xmlns:pic="http://schemas.openxmlformats.org/drawingml/2006/picture" xmlns:wp="http://schemas.openxmlformats.org/drawingml/2006/wordprocessingDrawing">
   <w:body>
+    <w:tbl>
+      <w:tblPr>
+        <w:tblW w:w="9864" w:type="dxa"/>
+        <w:jc w:val="center"/>
+        <w:tblBorders>
+          <w:top w:val="single" w:sz="10" w:space="0" w:color="8F1E18"/>
+          <w:left w:val="single" w:sz="10" w:space="0" w:color="8F1E18"/>
+          <w:bottom w:val="single" w:sz="10" w:space="0" w:color="8F1E18"/>
+          <w:right w:val="single" w:sz="10" w:space="0" w:color="8F1E18"/>
+          <w:insideH w:val="single" w:sz="10" w:space="0" w:color="8F1E18"/>
+        </w:tblBorders>
+        <w:tblLayout w:type="fixed"/>
+        <w:tblCellMar>
+          <w:top w:w="40" w:type="dxa"/>
+          <w:left w:w="140" w:type="dxa"/>
+          <w:bottom w:w="60" w:type="dxa"/>
+          <w:right w:w="140" w:type="dxa"/>
+        </w:tblCellMar>
+      </w:tblPr>
+      <w:tblGrid>
+        <w:gridCol w:w="9864"/>
+      </w:tblGrid>
+      <w:tr>
+        <w:trPr>
+          <w:cantSplit/>
+        </w:trPr>
+        <w:tc>
+          <w:tcPr>
+            <w:tcW w:w="9864" w:type="dxa"/>
+            <w:shd w:val="clear" w:color="auto" w:fill="8F1E18"/>
+          </w:tcPr>
+          <w:p>
+            <w:pPr>
+              <w:keepNext/>
+              <w:bidi/>
+              <w:spacing w:before="0" w:after="0"/>
+            </w:pPr>
+            <w:r>
+              <w:rPr>
+                <w:b/>
+                <w:bCs/>
+                <w:color w:val="FFFFFF"/>
+                <w:rtl/>
+              </w:rPr>
+              <w:t xml:space="preserve">مذكرة رقم 01</w:t>
+            </w:r>
+          </w:p>
+        </w:tc>
+      </w:tr>
+      <w:tr>
+        <w:tc>
+          <w:tcPr>
+            <w:tcW w:w="9864" w:type="dxa"/>
+            <w:shd w:val="clear" w:color="auto" w:fill="FBF4F4"/>
+          </w:tcPr>
+          <w:tbl>
+            <w:tblPr>
+              <w:tblStyle w:val="Table"/>
+              <w:tblW w:w="7128" w:type="dxa"/>
+              <w:jc w:val="center"/>
+              <w:tblBorders>
+                <w:top w:val="single" w:sz="4" w:space="0" w:color="000000"/>
+                <w:left w:val="single" w:sz="4" w:space="0" w:color="000000"/>
+                <w:bottom w:val="single" w:sz="4" w:space="0" w:color="000000"/>
+                <w:right w:val="single" w:sz="4" w:space="0" w:color="000000"/>
+                <w:insideH w:val="single" w:sz="4" w:space="0" w:color="000000"/>
+                <w:insideV w:val="single" w:sz="4" w:space="0" w:color="000000"/>
+              </w:tblBorders>
+              <w:tblLook w:firstRow="0" w:lastRow="0" w:firstColumn="0" w:lastColumn="0" w:noHBand="0" w:noVBand="0" w:val="0000"/>
+            </w:tblPr>
+            <w:tblGrid>
+              <w:gridCol w:w="3564"/>
+              <w:gridCol w:w="3564"/>
+            </w:tblGrid>
+            <w:tr>
+              <w:tc>
+                <w:tcPr/>
+                <w:p>
+                  <w:pPr>
+                    <w:pStyle w:val="Compact"/>
+                    <w:bidi/>
+                    <w:jc w:val="left"/>
+                  </w:pPr>
+                  <w:r>
+                    <w:rPr>
+                      <w:b/>
+                      <w:bCs/>
+                      <w:rtl/>
+                    </w:rPr>
+                    <w:t xml:space="preserve">المستوى:</w:t>
+                  </w:r>
+                  <w:r>
+                    <w:rPr>
+                      <w:rtl/>
+                    </w:rPr>
+                    <w:t xml:space="preserve"> </w:t>
+                  </w:r>
+                  <w:r>
+                    <w:rPr>
+                      <w:rtl/>
+                    </w:rPr>
+                    <w:t xml:space="preserve">1 ج م ع ت</w:t>
+                  </w:r>
+                </w:p>
+              </w:tc>
+              <w:tc>
+                <w:tcPr/>
+                <w:p>
+                  <w:pPr>
+                    <w:pStyle w:val="Compact"/>
+                    <w:bidi/>
+                    <w:jc w:val="left"/>
+                  </w:pPr>
+                  <w:r>
+                    <w:rPr>
+                      <w:b/>
+                      <w:bCs/>
+                      <w:rtl/>
+                    </w:rPr>
+                    <w:t xml:space="preserve">الثانوية:</w:t>
+                  </w:r>
+                  <w:r>
+                    <w:rPr>
+                      <w:rtl/>
+                    </w:rPr>
+                    <w:t xml:space="preserve"> </w:t>
+                  </w:r>
+                  <w:r>
+                    <w:rPr>
+                      <w:rtl/>
+                    </w:rPr>
+                    <w:t xml:space="preserve">..........</w:t>
+                  </w:r>
+                </w:p>
+              </w:tc>
+            </w:tr>
+            <w:tr>
+              <w:tc>
+                <w:tcPr/>
+                <w:p>
+                  <w:pPr>
+                    <w:pStyle w:val="Compact"/>
+                    <w:bidi/>
+                    <w:jc w:val="left"/>
+                  </w:pPr>
+                  <w:r>
+                    <w:rPr>
+                      <w:b/>
+                      <w:bCs/>
+                      <w:rtl/>
+                    </w:rPr>
+                    <w:t xml:space="preserve">المادة:</w:t>
+                  </w:r>
+                  <w:r>
+                    <w:rPr>
+                      <w:rtl/>
+                    </w:rPr>
+                    <w:t xml:space="preserve"> </w:t>
+                  </w:r>
+                  <w:r>
+                    <w:rPr>
+                      <w:rtl/>
+                    </w:rPr>
+                    <w:t xml:space="preserve">رياضيات</w:t>
+                  </w:r>
+                </w:p>
+              </w:tc>
+              <w:tc>
+                <w:tcPr/>
+                <w:p>
+                  <w:pPr>
+                    <w:pStyle w:val="Compact"/>
+                    <w:bidi/>
+                    <w:jc w:val="left"/>
+                  </w:pPr>
+                  <w:r>
+                    <w:rPr>
+                      <w:b/>
+                      <w:bCs/>
+                      <w:rtl/>
+                    </w:rPr>
+                    <w:t xml:space="preserve">ميدان التعلم:</w:t>
+                  </w:r>
+                  <w:r>
+                    <w:rPr>
+                      <w:rtl/>
+                    </w:rPr>
+                    <w:t xml:space="preserve"> </w:t>
+                  </w:r>
+                  <w:r>
+                    <w:rPr>
+                      <w:rtl/>
+                    </w:rPr>
+                    <w:t xml:space="preserve">الأعداد والحساب</w:t>
+                  </w:r>
+                </w:p>
+              </w:tc>
+            </w:tr>
+            <w:tr>
+              <w:tc>
+                <w:tcPr/>
+                <w:p>
+                  <w:pPr>
+                    <w:pStyle w:val="Compact"/>
+                    <w:bidi/>
+                    <w:jc w:val="left"/>
+                  </w:pPr>
+                  <w:r>
+                    <w:rPr>
+                      <w:b/>
+                      <w:bCs/>
+                      <w:rtl/>
+                    </w:rPr>
+                    <w:t xml:space="preserve">المدة:</w:t>
+                  </w:r>
+                  <w:r>
+                    <w:rPr>
+                      <w:rtl/>
+                    </w:rPr>
+                    <w:t xml:space="preserve"> </w:t>
+                  </w:r>
+                  <w:r>
+                    <w:rPr>
+                      <w:rtl/>
+                    </w:rPr>
+                    <w:t xml:space="preserve">1 سا</w:t>
+                  </w:r>
+                </w:p>
+              </w:tc>
+              <w:tc>
+                <w:tcPr/>
+                <w:p>
+                  <w:pPr>
+                    <w:pStyle w:val="Compact"/>
+                    <w:bidi/>
+                    <w:jc w:val="left"/>
+                  </w:pPr>
+                  <w:r>
+                    <w:rPr>
+                      <w:b/>
+                      <w:bCs/>
+                      <w:rtl/>
+                    </w:rPr>
+                    <w:t xml:space="preserve">الوحدة التعلمية:</w:t>
+                  </w:r>
+                  <w:r>
+                    <w:rPr>
+                      <w:rtl/>
+                    </w:rPr>
+                    <w:t xml:space="preserve"> </w:t>
+                  </w:r>
+                  <w:r>
+                    <w:rPr>
+                      <w:rtl/>
+                    </w:rPr>
+                    <w:t xml:space="preserve">الأعداد والحساب</w:t>
+                  </w:r>
+                </w:p>
+              </w:tc>
+            </w:tr>
+            <w:tr>
+              <w:tc>
+                <w:tcPr/>
+                <w:p>
+                  <w:pPr>
+                    <w:pStyle w:val="Compact"/>
+                    <w:bidi/>
+                    <w:jc w:val="left"/>
+                  </w:pPr>
+                  <w:r>
+                    <w:rPr>
+                      <w:b/>
+                      <w:bCs/>
+                      <w:rtl/>
+                    </w:rPr>
+                    <w:t xml:space="preserve">الأستاذ:</w:t>
+                  </w:r>
+                  <w:r>
+                    <w:rPr>
+                      <w:rtl/>
+                    </w:rPr>
+                    <w:t xml:space="preserve"> </w:t>
+                  </w:r>
+                  <w:r>
+                    <w:rPr>
+                      <w:rtl/>
+                    </w:rPr>
+                    <w:t xml:space="preserve">..........</w:t>
+                  </w:r>
+                </w:p>
+              </w:tc>
+              <w:tc>
+                <w:tcPr/>
+                <w:p>
+                  <w:pPr>
+                    <w:pStyle w:val="Compact"/>
+                    <w:bidi/>
+                    <w:jc w:val="left"/>
+                  </w:pPr>
+                  <w:r>
+                    <w:rPr>
+                      <w:b/>
+                      <w:bCs/>
+                      <w:rtl/>
+                    </w:rPr>
+                    <w:t xml:space="preserve">المحتوى المعرفي:</w:t>
+                  </w:r>
+                  <w:r>
+                    <w:rPr>
+                      <w:rtl/>
+                    </w:rPr>
+                    <w:t xml:space="preserve"> </w:t>
+                  </w:r>
+                  <w:r>
+                    <w:rPr>
+                      <w:rtl/>
+                    </w:rPr>
+                    <w:t xml:space="preserve">مجموعات الأعداد</w:t>
+                  </w:r>
+                  <w:r>
+                    <w:rPr>
+                      <w:rtl/>
+                    </w:rPr>
+                    <w:t xml:space="preserve"> </w:t>
+                  </w:r>
+                  <m:oMath>
+                    <m:r>
+                      <m:rPr>
+                        <m:sty m:val="p"/>
+                        <m:scr m:val="double-struck"/>
+                      </m:rPr>
+                      <m:t>N</m:t>
+                    </m:r>
+                  </m:oMath>
+                  <w:r>
+                    <w:rPr>
+                      <w:rtl/>
+                    </w:rPr>
+                    <w:t xml:space="preserve"> </w:t>
+                  </w:r>
+                  <w:r>
+                    <w:rPr>
+                      <w:rtl/>
+                    </w:rPr>
+                    <w:t xml:space="preserve">،</w:t>
+                  </w:r>
+                  <w:r>
+                    <w:rPr>
+                      <w:rtl/>
+                    </w:rPr>
+                    <w:t xml:space="preserve"> </w:t>
+                  </w:r>
+                  <m:oMath>
+                    <m:r>
+                      <m:rPr>
+                        <m:sty m:val="p"/>
+                        <m:scr m:val="double-struck"/>
+                      </m:rPr>
+                      <m:t>Z</m:t>
+                    </m:r>
+                  </m:oMath>
+                  <w:r>
+                    <w:rPr>
+                      <w:rtl/>
+                    </w:rPr>
+                    <w:t xml:space="preserve"> </w:t>
+                  </w:r>
+                  <w:r>
+                    <w:rPr>
+                      <w:rtl/>
+                    </w:rPr>
+                    <w:t xml:space="preserve">،</w:t>
+                  </w:r>
+                  <w:r>
+                    <w:rPr>
+                      <w:rtl/>
+                    </w:rPr>
+                    <w:t xml:space="preserve"> </w:t>
+                  </w:r>
+                  <m:oMath>
+                    <m:r>
+                      <m:rPr>
+                        <m:sty m:val="p"/>
+                        <m:scr m:val="double-struck"/>
+                      </m:rPr>
+                      <m:t>D</m:t>
+                    </m:r>
+                  </m:oMath>
+                  <w:r>
+                    <w:rPr>
+                      <w:rtl/>
+                    </w:rPr>
+                    <w:t xml:space="preserve"> </w:t>
+                  </w:r>
+                  <w:r>
+                    <w:rPr>
+                      <w:rtl/>
+                    </w:rPr>
+                    <w:t xml:space="preserve">،</w:t>
+                  </w:r>
+                  <w:r>
+                    <w:rPr>
+                      <w:rtl/>
+                    </w:rPr>
+                    <w:t xml:space="preserve"> </w:t>
+                  </w:r>
+                  <m:oMath>
+                    <m:r>
+                      <m:rPr>
+                        <m:sty m:val="p"/>
+                        <m:scr m:val="double-struck"/>
+                      </m:rPr>
+                      <m:t>Q</m:t>
+                    </m:r>
+                  </m:oMath>
+                  <w:r>
+                    <w:rPr>
+                      <w:rtl/>
+                    </w:rPr>
+                    <w:t xml:space="preserve"> </w:t>
+                  </w:r>
+                  <w:r>
+                    <w:rPr>
+                      <w:rtl/>
+                    </w:rPr>
+                    <w:t xml:space="preserve">،</w:t>
+                  </w:r>
+                  <w:r>
+                    <w:rPr>
+                      <w:rtl/>
+                    </w:rPr>
+                    <w:t xml:space="preserve"> </w:t>
+                  </w:r>
+                  <m:oMath>
+                    <m:r>
+                      <m:rPr>
+                        <m:sty m:val="p"/>
+                        <m:scr m:val="double-struck"/>
+                      </m:rPr>
+                      <m:t>R</m:t>
+                    </m:r>
+                  </m:oMath>
+                </w:p>
+              </w:tc>
+            </w:tr>
+          </w:tbl>
+          <w:p>
+            <w:pPr>
+              <w:bidi/>
+              <w:spacing w:before="120"/>
+            </w:pPr>
+          </w:p>
+        </w:tc>
+      </w:tr>
+    </w:tbl>
     <w:p>
       <w:pPr>
-        <w:numPr>
-          <w:ilvl w:val="0"/>
-          <w:numId w:val="1001"/>
-        </w:numPr>
         <w:bidi/>
+        <w:spacing w:before="0" w:after="0"/>
+      </w:pPr>
+    </w:p>
+    <w:tbl>
+      <w:tblPr>
+        <w:tblStyle w:val="Table"/>
+        <w:tblW w:w="7128" w:type="dxa"/>
+        <w:jc w:val="center"/>
+        <w:tblBorders>
+          <w:top w:val="single" w:sz="4" w:space="0" w:color="000000"/>
+          <w:left w:val="single" w:sz="4" w:space="0" w:color="000000"/>
+          <w:bottom w:val="single" w:sz="4" w:space="0" w:color="000000"/>
+          <w:right w:val="single" w:sz="4" w:space="0" w:color="000000"/>
+          <w:insideH w:val="single" w:sz="4" w:space="0" w:color="000000"/>
+          <w:insideV w:val="single" w:sz="4" w:space="0" w:color="000000"/>
+        </w:tblBorders>
+        <w:tblLook w:firstRow="0" w:lastRow="0" w:firstColumn="0" w:lastColumn="0" w:noHBand="0" w:noVBand="0" w:val="0000"/>
+      </w:tblPr>
+      <w:tblGrid>
+        <w:gridCol w:w="3564"/>
+        <w:gridCol w:w="3564"/>
+      </w:tblGrid>
+      <w:tr>
+        <w:tc>
+          <w:tcPr/>
+          <w:p>
+            <w:pPr>
+              <w:bidi/>
+              <w:jc w:val="left"/>
+            </w:pPr>
+            <w:r>
+              <w:rPr>
+                <w:b/>
+                <w:bCs/>
+                <w:rtl/>
+              </w:rPr>
+              <w:t xml:space="preserve">الكفاءات المستهدفة:</w:t>
+            </w:r>
+          </w:p>
+          <w:p>
+            <w:pPr>
+              <w:numPr>
+                <w:ilvl w:val="0"/>
+                <w:numId w:val="1001"/>
+              </w:numPr>
+              <w:bidi/>
+              <w:jc w:val="left"/>
+            </w:pPr>
+            <w:r>
+              <w:rPr>
+                <w:rtl/>
+              </w:rPr>
+              <w:t xml:space="preserve">التمييز بين مختلف أنواع الأعداد.</w:t>
+            </w:r>
+          </w:p>
+          <w:p>
+            <w:pPr>
+              <w:numPr>
+                <w:ilvl w:val="0"/>
+                <w:numId w:val="1001"/>
+              </w:numPr>
+              <w:bidi/>
+              <w:jc w:val="left"/>
+            </w:pPr>
+            <w:r>
+              <w:rPr>
+                <w:rtl/>
+              </w:rPr>
+              <w:t xml:space="preserve">استعمال الرموز</w:t>
+            </w:r>
+            <w:r>
+              <w:rPr>
+                <w:rtl/>
+              </w:rPr>
+              <w:t xml:space="preserve"> </w:t>
+            </w:r>
+            <m:oMath>
+              <m:r>
+                <m:rPr>
+                  <m:sty m:val="p"/>
+                </m:rPr>
+                <m:t>∈</m:t>
+              </m:r>
+            </m:oMath>
+            <w:r>
+              <w:rPr>
+                <w:rtl/>
+              </w:rPr>
+              <w:t xml:space="preserve"> </w:t>
+            </w:r>
+            <w:r>
+              <w:rPr>
+                <w:rtl/>
+              </w:rPr>
+              <w:t xml:space="preserve">،</w:t>
+            </w:r>
+            <w:r>
+              <w:rPr>
+                <w:rtl/>
+              </w:rPr>
+              <w:t xml:space="preserve"> </w:t>
+            </w:r>
+            <m:oMath>
+              <m:r>
+                <m:rPr>
+                  <m:sty m:val="p"/>
+                </m:rPr>
+                <m:t>∉</m:t>
+              </m:r>
+            </m:oMath>
+            <w:r>
+              <w:rPr>
+                <w:rtl/>
+              </w:rPr>
+              <w:t xml:space="preserve"> </w:t>
+            </w:r>
+            <w:r>
+              <w:rPr>
+                <w:rtl/>
+              </w:rPr>
+              <w:t xml:space="preserve">،</w:t>
+            </w:r>
+            <w:r>
+              <w:rPr>
+                <w:rtl/>
+              </w:rPr>
+              <w:t xml:space="preserve"> </w:t>
+            </w:r>
+            <m:oMath>
+              <m:r>
+                <m:rPr>
+                  <m:sty m:val="p"/>
+                </m:rPr>
+                <m:t>⊂</m:t>
+              </m:r>
+            </m:oMath>
+            <w:r>
+              <w:rPr>
+                <w:rtl/>
+              </w:rPr>
+              <w:t xml:space="preserve">.</w:t>
+            </w:r>
+          </w:p>
+          <w:p>
+            <w:pPr>
+              <w:numPr>
+                <w:ilvl w:val="0"/>
+                <w:numId w:val="1001"/>
+              </w:numPr>
+              <w:bidi/>
+              <w:jc w:val="left"/>
+            </w:pPr>
+            <w:r>
+              <w:rPr>
+                <w:rtl/>
+              </w:rPr>
+              <w:t xml:space="preserve">معرفة ترتيب المجموعات</w:t>
+            </w:r>
+            <w:r>
+              <w:rPr>
+                <w:rtl/>
+              </w:rPr>
+              <w:t xml:space="preserve"> </w:t>
+            </w:r>
+            <m:oMath>
+              <m:r>
+                <m:rPr>
+                  <m:sty m:val="p"/>
+                  <m:scr m:val="double-struck"/>
+                </m:rPr>
+                <m:t>N</m:t>
+              </m:r>
+              <m:r>
+                <m:rPr>
+                  <m:sty m:val="p"/>
+                </m:rPr>
+                <m:t>⊂</m:t>
+              </m:r>
+              <m:r>
+                <m:rPr>
+                  <m:sty m:val="p"/>
+                  <m:scr m:val="double-struck"/>
+                </m:rPr>
+                <m:t>Z</m:t>
+              </m:r>
+              <m:r>
+                <m:rPr>
+                  <m:sty m:val="p"/>
+                </m:rPr>
+                <m:t>⊂</m:t>
+              </m:r>
+              <m:r>
+                <m:rPr>
+                  <m:sty m:val="p"/>
+                  <m:scr m:val="double-struck"/>
+                </m:rPr>
+                <m:t>D</m:t>
+              </m:r>
+              <m:r>
+                <m:rPr>
+                  <m:sty m:val="p"/>
+                </m:rPr>
+                <m:t>⊂</m:t>
+              </m:r>
+              <m:r>
+                <m:rPr>
+                  <m:sty m:val="p"/>
+                  <m:scr m:val="double-struck"/>
+                </m:rPr>
+                <m:t>Q</m:t>
+              </m:r>
+              <m:r>
+                <m:rPr>
+                  <m:sty m:val="p"/>
+                </m:rPr>
+                <m:t>⊂</m:t>
+              </m:r>
+              <m:r>
+                <m:rPr>
+                  <m:sty m:val="p"/>
+                  <m:scr m:val="double-struck"/>
+                </m:rPr>
+                <m:t>R</m:t>
+              </m:r>
+            </m:oMath>
+            <w:r>
+              <w:rPr>
+                <w:rtl/>
+              </w:rPr>
+              <w:t xml:space="preserve">.</w:t>
+            </w:r>
+          </w:p>
+        </w:tc>
+        <w:tc>
+          <w:tcPr/>
+          <w:p>
+            <w:pPr>
+              <w:bidi/>
+              <w:jc w:val="left"/>
+            </w:pPr>
+            <w:r>
+              <w:rPr>
+                <w:b/>
+                <w:bCs/>
+                <w:rtl/>
+              </w:rPr>
+              <w:t xml:space="preserve">الكفاءات القبلية:</w:t>
+            </w:r>
+          </w:p>
+          <w:p>
+            <w:pPr>
+              <w:numPr>
+                <w:ilvl w:val="0"/>
+                <w:numId w:val="1002"/>
+              </w:numPr>
+              <w:bidi/>
+              <w:jc w:val="left"/>
+            </w:pPr>
+            <w:r>
+              <w:rPr>
+                <w:rtl/>
+              </w:rPr>
+              <w:t xml:space="preserve">الأعداد الطبيعية والأعداد النسبية (التعليم المتوسط).</w:t>
+            </w:r>
+          </w:p>
+          <w:p>
+            <w:pPr>
+              <w:numPr>
+                <w:ilvl w:val="0"/>
+                <w:numId w:val="1002"/>
+              </w:numPr>
+              <w:bidi/>
+              <w:jc w:val="left"/>
+            </w:pPr>
+            <w:r>
+              <w:rPr>
+                <w:rtl/>
+              </w:rPr>
+              <w:t xml:space="preserve">الكسور والكتابة العشرية لعدد.</w:t>
+            </w:r>
+          </w:p>
+          <w:p>
+            <w:pPr>
+              <w:numPr>
+                <w:ilvl w:val="0"/>
+                <w:numId w:val="1002"/>
+              </w:numPr>
+              <w:bidi/>
+              <w:jc w:val="left"/>
+            </w:pPr>
+            <w:r>
+              <w:rPr>
+                <w:rtl/>
+              </w:rPr>
+              <w:t xml:space="preserve">الجذر التربيعي لعدد موجب.</w:t>
+            </w:r>
+          </w:p>
+        </w:tc>
+      </w:tr>
+    </w:tbl>
+    <w:p>
+      <w:pPr>
+        <w:bidi/>
+        <w:spacing w:before="120"/>
       </w:pPr>
       <w:r>
         <w:rPr>
+          <w:b/>
+          <w:bCs/>
           <w:rtl/>
         </w:rPr>
-        <w:t xml:space="preserve">الأعداد الطبيعية والأعداد النسبية (التعليم المتوسط).</w:t>
+        <w:t xml:space="preserve">الوسائل:</w:t>
       </w:r>
-    </w:p>
-    <w:p>
-      <w:pPr>
-        <w:numPr>
-          <w:ilvl w:val="0"/>
-          <w:numId w:val="1001"/>
-        </w:numPr>
-        <w:bidi/>
-      </w:pPr>
-      <w:r>
-        <w:rPr>
-          <w:rtl/>
-        </w:rPr>
-        <w:t xml:space="preserve">الكسور والكتابة العشرية لعدد.</w:t>
-      </w:r>
-    </w:p>
-    <w:p>
-      <w:pPr>
-        <w:numPr>
-          <w:ilvl w:val="0"/>
-          <w:numId w:val="1001"/>
-        </w:numPr>
-        <w:bidi/>
-      </w:pPr>
-      <w:r>
-        <w:rPr>
-          <w:rtl/>
-        </w:rPr>
-        <w:t xml:space="preserve">الجذر التربيعي لعدد موجب.</w:t>
-      </w:r>
-    </w:p>
-    <w:p>
-      <w:pPr>
-        <w:numPr>
-          <w:ilvl w:val="0"/>
-          <w:numId w:val="1002"/>
-        </w:numPr>
-        <w:bidi/>
-      </w:pPr>
-      <w:r>
-        <w:rPr>
-          <w:rtl/>
-        </w:rPr>
-        <w:t xml:space="preserve">التمييز بين مختلف أنواع الأعداد.</w:t>
-      </w:r>
-    </w:p>
-    <w:p>
-      <w:pPr>
-        <w:numPr>
-          <w:ilvl w:val="0"/>
-          <w:numId w:val="1002"/>
-        </w:numPr>
-        <w:bidi/>
-      </w:pPr>
-      <w:r>
-        <w:rPr>
-          <w:rtl/>
-        </w:rPr>
-        <w:t xml:space="preserve">استعمال الرموز</w:t>
-      </w:r>
-      <w:r>
-        <w:rPr>
-          <w:rtl/>
-        </w:rPr>
-        <w:t xml:space="preserve"> </w:t>
-      </w:r>
-      <m:oMath>
-        <m:r>
-          <m:rPr>
-            <m:sty m:val="p"/>
-          </m:rPr>
-          <m:t>∈</m:t>
-        </m:r>
-      </m:oMath>
       <w:r>
         <w:rPr>
           <w:rtl/>
@@ -100,157 +783,3164 @@
         <w:rPr>
           <w:rtl/>
         </w:rPr>
-        <w:t xml:space="preserve">،</w:t>
-      </w:r>
-      <w:r>
-        <w:rPr>
-          <w:rtl/>
-        </w:rPr>
-        <w:t xml:space="preserve"> </w:t>
-      </w:r>
-      <m:oMath>
-        <m:r>
-          <m:rPr>
-            <m:sty m:val="p"/>
-          </m:rPr>
-          <m:t>∉</m:t>
-        </m:r>
-      </m:oMath>
-      <w:r>
-        <w:rPr>
-          <w:rtl/>
-        </w:rPr>
-        <w:t xml:space="preserve"> </w:t>
-      </w:r>
-      <w:r>
-        <w:rPr>
-          <w:rtl/>
-        </w:rPr>
-        <w:t xml:space="preserve">،</w:t>
-      </w:r>
-      <w:r>
-        <w:rPr>
-          <w:rtl/>
-        </w:rPr>
-        <w:t xml:space="preserve"> </w:t>
-      </w:r>
-      <m:oMath>
-        <m:r>
-          <m:rPr>
-            <m:sty m:val="p"/>
-          </m:rPr>
-          <m:t>⊂</m:t>
-        </m:r>
-      </m:oMath>
-      <w:r>
-        <w:rPr>
-          <w:rtl/>
-        </w:rPr>
-        <w:t xml:space="preserve">.</w:t>
-      </w:r>
-    </w:p>
-    <w:p>
-      <w:pPr>
-        <w:numPr>
-          <w:ilvl w:val="0"/>
-          <w:numId w:val="1002"/>
-        </w:numPr>
-        <w:bidi/>
-      </w:pPr>
-      <w:r>
-        <w:rPr>
-          <w:rtl/>
-        </w:rPr>
-        <w:t xml:space="preserve">معرفة ترتيب المجموعات</w:t>
-      </w:r>
-      <w:r>
-        <w:rPr>
-          <w:rtl/>
-        </w:rPr>
-        <w:t xml:space="preserve"> </w:t>
-      </w:r>
-      <m:oMath>
-        <m:r>
-          <m:rPr>
-            <m:sty m:val="p"/>
-            <m:scr m:val="double-struck"/>
-          </m:rPr>
-          <m:t>N</m:t>
-        </m:r>
-        <m:r>
-          <m:rPr>
-            <m:sty m:val="p"/>
-          </m:rPr>
-          <m:t>⊂</m:t>
-        </m:r>
-        <m:r>
-          <m:rPr>
-            <m:sty m:val="p"/>
-            <m:scr m:val="double-struck"/>
-          </m:rPr>
-          <m:t>Z</m:t>
-        </m:r>
-        <m:r>
-          <m:rPr>
-            <m:sty m:val="p"/>
-          </m:rPr>
-          <m:t>⊂</m:t>
-        </m:r>
-        <m:r>
-          <m:rPr>
-            <m:sty m:val="p"/>
-            <m:scr m:val="double-struck"/>
-          </m:rPr>
-          <m:t>D</m:t>
-        </m:r>
-        <m:r>
-          <m:rPr>
-            <m:sty m:val="p"/>
-          </m:rPr>
-          <m:t>⊂</m:t>
-        </m:r>
-        <m:r>
-          <m:rPr>
-            <m:sty m:val="p"/>
-            <m:scr m:val="double-struck"/>
-          </m:rPr>
-          <m:t>Q</m:t>
-        </m:r>
-        <m:r>
-          <m:rPr>
-            <m:sty m:val="p"/>
-          </m:rPr>
-          <m:t>⊂</m:t>
-        </m:r>
-        <m:r>
-          <m:rPr>
-            <m:sty m:val="p"/>
-            <m:scr m:val="double-struck"/>
-          </m:rPr>
-          <m:t>R</m:t>
-        </m:r>
-      </m:oMath>
-      <w:r>
-        <w:rPr>
-          <w:rtl/>
-        </w:rPr>
-        <w:t xml:space="preserve">.</w:t>
-      </w:r>
-    </w:p>
-    <w:p>
-      <w:pPr>
-        <w:bidi/>
-      </w:pPr>
-      <w:r>
-        <w:rPr>
-          <w:rtl/>
-        </w:rPr>
         <w:t xml:space="preserve">الكتاب المدرسي (باب «الأعداد والحساب»: نشاط 1) ، السبورة ، الحاسبة.</w:t>
       </w:r>
     </w:p>
+    <w:tbl>
+      <w:tblPr>
+        <w:tblStyle w:val="Table"/>
+        <w:tblW w:w="7681" w:type="dxa"/>
+        <w:jc w:val="center"/>
+        <w:tblBorders>
+          <w:top w:val="single" w:sz="4" w:space="0" w:color="000000"/>
+          <w:left w:val="single" w:sz="4" w:space="0" w:color="000000"/>
+          <w:bottom w:val="single" w:sz="4" w:space="0" w:color="000000"/>
+          <w:right w:val="single" w:sz="4" w:space="0" w:color="000000"/>
+          <w:insideH w:val="single" w:sz="4" w:space="0" w:color="000000"/>
+          <w:insideV w:val="single" w:sz="4" w:space="0" w:color="000000"/>
+        </w:tblBorders>
+        <w:tblLook w:firstRow="0" w:lastRow="0" w:firstColumn="0" w:lastColumn="0" w:noHBand="0" w:noVBand="0" w:val="0000"/>
+      </w:tblPr>
+      <w:tblGrid>
+        <w:gridCol w:w="1188"/>
+        <w:gridCol w:w="712"/>
+        <w:gridCol w:w="4593"/>
+        <w:gridCol w:w="1188"/>
+      </w:tblGrid>
+      <w:tr>
+        <w:tc>
+          <w:tcPr>
+            <w:shd w:val="clear" w:color="auto" w:fill="E4E7ED"/>
+          </w:tcPr>
+          <w:p>
+            <w:pPr>
+              <w:pStyle w:val="Compact"/>
+              <w:bidi/>
+              <w:jc w:val="left"/>
+            </w:pPr>
+            <w:r>
+              <w:rPr>
+                <w:rtl/>
+              </w:rPr>
+              <w:t xml:space="preserve"/>
+            </w:r>
+            <w:r>
+              <w:rPr>
+                <w:b/>
+                <w:bCs/>
+                <w:rtl/>
+              </w:rPr>
+              <w:t xml:space="preserve">توجيهات وتعاليق</w:t>
+            </w:r>
+          </w:p>
+        </w:tc>
+        <w:tc>
+          <w:tcPr>
+            <w:shd w:val="clear" w:color="auto" w:fill="E4E7ED"/>
+          </w:tcPr>
+          <w:p>
+            <w:pPr>
+              <w:pStyle w:val="Compact"/>
+              <w:bidi/>
+              <w:jc w:val="left"/>
+            </w:pPr>
+            <w:r>
+              <w:rPr>
+                <w:b/>
+                <w:bCs/>
+                <w:rtl/>
+              </w:rPr>
+              <w:t xml:space="preserve">المدة</w:t>
+            </w:r>
+          </w:p>
+        </w:tc>
+        <w:tc>
+          <w:tcPr>
+            <w:shd w:val="clear" w:color="auto" w:fill="E4E7ED"/>
+          </w:tcPr>
+          <w:p>
+            <w:pPr>
+              <w:pStyle w:val="Compact"/>
+              <w:bidi/>
+              <w:jc w:val="left"/>
+            </w:pPr>
+            <w:r>
+              <w:rPr>
+                <w:b/>
+                <w:bCs/>
+                <w:rtl/>
+              </w:rPr>
+              <w:t xml:space="preserve">سير الحصة</w:t>
+            </w:r>
+          </w:p>
+        </w:tc>
+        <w:tc>
+          <w:tcPr>
+            <w:shd w:val="clear" w:color="auto" w:fill="E4E7ED"/>
+          </w:tcPr>
+          <w:p>
+            <w:pPr>
+              <w:pStyle w:val="Compact"/>
+              <w:bidi/>
+              <w:jc w:val="left"/>
+            </w:pPr>
+            <w:r>
+              <w:rPr>
+                <w:b/>
+                <w:bCs/>
+                <w:rtl/>
+              </w:rPr>
+              <w:t xml:space="preserve">مراحل الحصة</w:t>
+            </w:r>
+          </w:p>
+        </w:tc>
+      </w:tr>
+      <w:tr>
+        <w:tc>
+          <w:tcPr/>
+          <w:p>
+            <w:pPr>
+              <w:pStyle w:val="Compact"/>
+              <w:bidi/>
+              <w:jc w:val="left"/>
+            </w:pPr>
+            <w:r>
+              <w:rPr>
+                <w:rtl/>
+              </w:rPr>
+              <w:t xml:space="preserve">نستثمر مكتسبات التعليم المتوسط ونكتب أجوبة التلاميذ على جانب السبورة.</w:t>
+            </w:r>
+          </w:p>
+        </w:tc>
+        <w:tc>
+          <w:tcPr/>
+          <w:p>
+            <w:pPr>
+              <w:pStyle w:val="Compact"/>
+              <w:bidi/>
+              <w:jc w:val="left"/>
+            </w:pPr>
+            <w:r>
+              <w:rPr>
+                <w:rtl/>
+              </w:rPr>
+              <w:t xml:space="preserve">5 د</w:t>
+            </w:r>
+          </w:p>
+        </w:tc>
+        <w:tc>
+          <w:tcPr/>
+          <w:p>
+            <w:pPr>
+              <w:bidi/>
+              <w:jc w:val="left"/>
+            </w:pPr>
+            <w:r>
+              <w:rPr>
+                <w:b/>
+                <w:bCs/>
+                <w:rtl/>
+              </w:rPr>
+              <w:t xml:space="preserve">سؤال شفهي:</w:t>
+            </w:r>
+            <w:r>
+              <w:rPr>
+                <w:rtl/>
+              </w:rPr>
+              <w:t xml:space="preserve"> </w:t>
+            </w:r>
+            <w:r>
+              <w:rPr>
+                <w:rtl/>
+              </w:rPr>
+              <w:t xml:space="preserve">ما الأعداد التي تعرفها؟ هل كل الأعداد من نفس «النوع»؟</w:t>
+            </w:r>
+          </w:p>
+          <w:p>
+            <w:pPr>
+              <w:bidi/>
+              <w:jc w:val="left"/>
+            </w:pPr>
+            <w:r>
+              <w:rPr>
+                <w:rtl/>
+              </w:rPr>
+              <w:t xml:space="preserve">يذكر التلاميذ: أعداد طبيعية (</w:t>
+            </w:r>
+            <m:oMath>
+              <m:r>
+                <m:t>0</m:t>
+              </m:r>
+            </m:oMath>
+            <w:r>
+              <w:rPr>
+                <w:rtl/>
+              </w:rPr>
+              <w:t xml:space="preserve"> </w:t>
+            </w:r>
+            <w:r>
+              <w:rPr>
+                <w:rtl/>
+              </w:rPr>
+              <w:t xml:space="preserve">،</w:t>
+            </w:r>
+            <w:r>
+              <w:rPr>
+                <w:rtl/>
+              </w:rPr>
+              <w:t xml:space="preserve"> </w:t>
+            </w:r>
+            <m:oMath>
+              <m:r>
+                <m:t>1</m:t>
+              </m:r>
+            </m:oMath>
+            <w:r>
+              <w:rPr>
+                <w:rtl/>
+              </w:rPr>
+              <w:t xml:space="preserve"> </w:t>
+            </w:r>
+            <w:r>
+              <w:rPr>
+                <w:rtl/>
+              </w:rPr>
+              <w:t xml:space="preserve">،</w:t>
+            </w:r>
+            <w:r>
+              <w:rPr>
+                <w:rtl/>
+              </w:rPr>
+              <w:t xml:space="preserve"> </w:t>
+            </w:r>
+            <m:oMath>
+              <m:r>
+                <m:t>2</m:t>
+              </m:r>
+            </m:oMath>
+            <w:r>
+              <w:rPr>
+                <w:rtl/>
+              </w:rPr>
+              <w:t xml:space="preserve"> </w:t>
+            </w:r>
+            <w:r>
+              <w:rPr>
+                <w:rtl/>
+              </w:rPr>
+              <w:t xml:space="preserve">،</w:t>
+            </w:r>
+            <w:r>
+              <w:rPr>
+                <w:rtl/>
+              </w:rPr>
+              <w:t xml:space="preserve"> </w:t>
+            </w:r>
+            <m:oMath>
+              <m:r>
+                <m:rPr>
+                  <m:sty m:val="p"/>
+                </m:rPr>
+                <m:t>…</m:t>
+              </m:r>
+            </m:oMath>
+            <w:r>
+              <w:rPr>
+                <w:rtl/>
+              </w:rPr>
+              <w:t xml:space="preserve">) ، أعداد سالبة ، كسور ، أعداد عشرية ،</w:t>
+            </w:r>
+            <w:r>
+              <w:rPr>
+                <w:rtl/>
+              </w:rPr>
+              <w:t xml:space="preserve"> </w:t>
+            </w:r>
+            <m:oMath>
+              <m:rad>
+                <m:radPr>
+                  <m:degHide m:val="on"/>
+                </m:radPr>
+                <m:deg/>
+                <m:e>
+                  <m:r>
+                    <m:t>2</m:t>
+                  </m:r>
+                </m:e>
+              </m:rad>
+            </m:oMath>
+            <w:r>
+              <w:rPr>
+                <w:rtl/>
+              </w:rPr>
+              <w:t xml:space="preserve"> </w:t>
+            </w:r>
+            <w:r>
+              <w:rPr>
+                <w:rtl/>
+              </w:rPr>
+              <w:t xml:space="preserve">،</w:t>
+            </w:r>
+            <w:r>
+              <w:rPr>
+                <w:rtl/>
+              </w:rPr>
+              <w:t xml:space="preserve"> </w:t>
+            </w:r>
+            <m:oMath>
+              <m:r>
+                <m:t>π</m:t>
+              </m:r>
+            </m:oMath>
+            <w:r>
+              <w:rPr>
+                <w:rtl/>
+              </w:rPr>
+              <w:t xml:space="preserve">.</w:t>
+            </w:r>
+          </w:p>
+          <w:p>
+            <w:pPr>
+              <w:bidi/>
+              <w:jc w:val="left"/>
+            </w:pPr>
+            <w:r>
+              <w:rPr>
+                <w:b/>
+                <w:bCs/>
+                <w:rtl/>
+              </w:rPr>
+              <w:t xml:space="preserve">الإشكالية:</w:t>
+            </w:r>
+            <w:r>
+              <w:rPr>
+                <w:rtl/>
+              </w:rPr>
+              <w:t xml:space="preserve"> </w:t>
+            </w:r>
+            <w:r>
+              <w:rPr>
+                <w:rtl/>
+              </w:rPr>
+              <w:t xml:space="preserve">كيف نصنّف هذه الأعداد؟</w:t>
+            </w:r>
+          </w:p>
+        </w:tc>
+        <w:tc>
+          <w:tcPr>
+            <w:shd w:val="clear" w:color="auto" w:fill="E4E7ED"/>
+          </w:tcPr>
+          <w:p>
+            <w:pPr>
+              <w:pStyle w:val="Compact"/>
+              <w:bidi/>
+              <w:jc w:val="left"/>
+            </w:pPr>
+            <w:r>
+              <w:rPr>
+                <w:rtl/>
+              </w:rPr>
+              <w:t xml:space="preserve"/>
+            </w:r>
+            <w:r>
+              <w:rPr>
+                <w:b/>
+                <w:bCs/>
+                <w:rtl/>
+              </w:rPr>
+              <w:t xml:space="preserve">وضعية انطلاقية</w:t>
+            </w:r>
+          </w:p>
+        </w:tc>
+      </w:tr>
+      <w:tr>
+        <w:tc>
+          <w:tcPr/>
+          <w:p>
+            <w:pPr>
+              <w:pStyle w:val="Compact"/>
+              <w:bidi/>
+              <w:jc w:val="left"/>
+            </w:pPr>
+            <w:r>
+              <w:rPr>
+                <w:rtl/>
+              </w:rPr>
+              <w:t xml:space="preserve">عمل فردي (</w:t>
+            </w:r>
+            <m:oMath>
+              <m:r>
+                <m:t>8</m:t>
+              </m:r>
+            </m:oMath>
+            <w:r>
+              <w:rPr>
+                <w:rtl/>
+              </w:rPr>
+              <w:t xml:space="preserve"> </w:t>
+            </w:r>
+            <w:r>
+              <w:rPr>
+                <w:rtl/>
+              </w:rPr>
+              <w:t xml:space="preserve">د) ثم ثنائي. نتجول بين الصفوف ونرصد الأخطاء:</w:t>
+            </w:r>
+            <w:r>
+              <w:rPr>
+                <w:rtl/>
+              </w:rPr>
+              <w:t xml:space="preserve"> </w:t>
+            </w:r>
+            <m:oMath>
+              <m:r>
+                <m:rPr>
+                  <m:sty m:val="p"/>
+                </m:rPr>
+                <m:t>−</m:t>
+              </m:r>
+              <m:f>
+                <m:fPr>
+                  <m:type m:val="bar"/>
+                </m:fPr>
+                <m:num>
+                  <m:r>
+                    <m:t>12</m:t>
+                  </m:r>
+                </m:num>
+                <m:den>
+                  <m:r>
+                    <m:t>4</m:t>
+                  </m:r>
+                </m:den>
+              </m:f>
+            </m:oMath>
+            <w:r>
+              <w:rPr>
+                <w:rtl/>
+              </w:rPr>
+              <w:t xml:space="preserve"> </w:t>
+            </w:r>
+            <w:r>
+              <w:rPr>
+                <w:rtl/>
+              </w:rPr>
+              <w:t xml:space="preserve">و</w:t>
+            </w:r>
+            <w:r>
+              <w:rPr>
+                <w:rtl/>
+              </w:rPr>
+              <w:t xml:space="preserve"> </w:t>
+            </w:r>
+            <m:oMath>
+              <m:rad>
+                <m:radPr>
+                  <m:degHide m:val="on"/>
+                </m:radPr>
+                <m:deg/>
+                <m:e>
+                  <m:r>
+                    <m:t>9</m:t>
+                  </m:r>
+                </m:e>
+              </m:rad>
+            </m:oMath>
+            <w:r>
+              <w:rPr>
+                <w:rtl/>
+              </w:rPr>
+              <w:t xml:space="preserve">.</w:t>
+            </w:r>
+          </w:p>
+        </w:tc>
+        <w:tc>
+          <w:tcPr/>
+          <w:p>
+            <w:pPr>
+              <w:pStyle w:val="Compact"/>
+              <w:bidi/>
+              <w:jc w:val="left"/>
+            </w:pPr>
+            <w:r>
+              <w:rPr>
+                <w:rtl/>
+              </w:rPr>
+              <w:t xml:space="preserve">15 د</w:t>
+            </w:r>
+          </w:p>
+        </w:tc>
+        <w:tc>
+          <w:tcPr/>
+          <w:p>
+            <w:pPr>
+              <w:bidi/>
+              <w:jc w:val="left"/>
+            </w:pPr>
+            <w:r>
+              <w:rPr>
+                <w:b/>
+                <w:bCs/>
+                <w:rtl/>
+              </w:rPr>
+              <w:t xml:space="preserve">نشاط</w:t>
+            </w:r>
+            <w:r>
+              <w:rPr>
+                <w:rtl/>
+              </w:rPr>
+              <w:t xml:space="preserve"> </w:t>
+            </w:r>
+            <w:r>
+              <w:rPr>
+                <w:rtl/>
+              </w:rPr>
+              <w:t xml:space="preserve">(مستوحى من نشاط 1 من الكتاب المدرسي): ضع العلامة</w:t>
+            </w:r>
+            <w:r>
+              <w:rPr>
+                <w:rtl/>
+              </w:rPr>
+              <w:t xml:space="preserve"> </w:t>
+            </w:r>
+            <m:oMath>
+              <m:r>
+                <m:rPr>
+                  <m:sty m:val="p"/>
+                </m:rPr>
+                <m:t>×</m:t>
+              </m:r>
+            </m:oMath>
+            <w:r>
+              <w:rPr>
+                <w:rtl/>
+              </w:rPr>
+              <w:t xml:space="preserve"> </w:t>
+            </w:r>
+            <w:r>
+              <w:rPr>
+                <w:rtl/>
+              </w:rPr>
+              <w:t xml:space="preserve">في الخانة المناسبة عندما ينتمي العدد إلى المجموعة:</w:t>
+            </w:r>
+          </w:p>
+          <w:p>
+            <w:pPr>
+              <w:bidi/>
+              <w:jc w:val="center"/>
+            </w:pPr>
+            <w:r>
+              <w:rPr>
+                <w:rtl/>
+              </w:rPr>
+              <w:drawing>
+                <wp:inline>
+                  <wp:extent cx="2772554" cy="1147411"/>
+                  <wp:docPr id="1" name="Picture 1"/>
+                  <wp:cNvGraphicFramePr>
+                    <a:graphicFrameLocks noChangeAspect="1"/>
+                  </wp:cNvGraphicFramePr>
+                  <a:graphic>
+                    <a:graphicData uri="http://schemas.openxmlformats.org/drawingml/2006/picture">
+                      <pic:pic>
+                        <pic:nvPicPr>
+                          <pic:cNvPr id="0" name="55c2bcfa13ec7120.png"/>
+                          <pic:cNvPicPr/>
+                        </pic:nvPicPr>
+                        <pic:blipFill>
+                          <a:blip r:embed="rId9"/>
+                          <a:stretch>
+                            <a:fillRect/>
+                          </a:stretch>
+                        </pic:blipFill>
+                        <pic:spPr>
+                          <a:xfrm>
+                            <a:off x="0" y="0"/>
+                            <a:ext cx="2772554" cy="1147411"/>
+                          </a:xfrm>
+                          <a:prstGeom prst="rect"/>
+                        </pic:spPr>
+                      </pic:pic>
+                    </a:graphicData>
+                  </a:graphic>
+                </wp:inline>
+              </w:drawing>
+            </w:r>
+          </w:p>
+        </w:tc>
+        <w:tc>
+          <w:tcPr>
+            <w:shd w:val="clear" w:color="auto" w:fill="E4E7ED"/>
+          </w:tcPr>
+          <w:p>
+            <w:pPr>
+              <w:pStyle w:val="Compact"/>
+              <w:bidi/>
+              <w:jc w:val="left"/>
+            </w:pPr>
+            <w:r>
+              <w:rPr>
+                <w:rtl/>
+              </w:rPr>
+              <w:t xml:space="preserve"/>
+            </w:r>
+            <w:r>
+              <w:rPr>
+                <w:b/>
+                <w:bCs/>
+                <w:rtl/>
+              </w:rPr>
+              <w:t xml:space="preserve">النشاط</w:t>
+            </w:r>
+          </w:p>
+        </w:tc>
+      </w:tr>
+      <w:tr>
+        <w:tc>
+          <w:tcPr/>
+          <w:p>
+            <w:pPr>
+              <w:pStyle w:val="Compact"/>
+              <w:bidi/>
+              <w:jc w:val="left"/>
+            </w:pPr>
+            <w:r>
+              <w:rPr>
+                <w:rtl/>
+              </w:rPr>
+              <w:t xml:space="preserve">تصحيح جماعي على السبورة ؛ نطلب من التلاميذ تبرير كل علامة.</w:t>
+            </w:r>
+          </w:p>
+        </w:tc>
+        <w:tc>
+          <w:tcPr/>
+          <w:p>
+            <w:pPr>
+              <w:pStyle w:val="Compact"/>
+              <w:bidi/>
+              <w:jc w:val="left"/>
+            </w:pPr>
+            <w:r>
+              <w:rPr>
+                <w:rtl/>
+              </w:rPr>
+              <w:t xml:space="preserve">10 د</w:t>
+            </w:r>
+          </w:p>
+        </w:tc>
+        <w:tc>
+          <w:tcPr/>
+          <w:p>
+            <w:pPr>
+              <w:numPr>
+                <w:ilvl w:val="0"/>
+                <w:numId w:val="1003"/>
+              </w:numPr>
+              <w:bidi/>
+              <w:jc w:val="left"/>
+            </w:pPr>
+            <m:oMath>
+              <m:rad>
+                <m:radPr>
+                  <m:degHide m:val="on"/>
+                </m:radPr>
+                <m:deg/>
+                <m:e>
+                  <m:r>
+                    <m:t>9</m:t>
+                  </m:r>
+                </m:e>
+              </m:rad>
+              <m:r>
+                <m:rPr>
+                  <m:sty m:val="p"/>
+                </m:rPr>
+                <m:t>=</m:t>
+              </m:r>
+              <m:r>
+                <m:t>3</m:t>
+              </m:r>
+            </m:oMath>
+            <w:r>
+              <w:rPr>
+                <w:rtl/>
+              </w:rPr>
+              <w:t xml:space="preserve"> </w:t>
+            </w:r>
+            <w:r>
+              <w:rPr>
+                <w:rtl/>
+              </w:rPr>
+              <w:t xml:space="preserve">و</w:t>
+            </w:r>
+            <w:r>
+              <w:rPr>
+                <w:rtl/>
+              </w:rPr>
+              <w:t xml:space="preserve"> </w:t>
+            </w:r>
+            <m:oMath>
+              <m:r>
+                <m:rPr>
+                  <m:sty m:val="p"/>
+                </m:rPr>
+                <m:t>−</m:t>
+              </m:r>
+              <m:f>
+                <m:fPr>
+                  <m:type m:val="bar"/>
+                </m:fPr>
+                <m:num>
+                  <m:r>
+                    <m:t>12</m:t>
+                  </m:r>
+                </m:num>
+                <m:den>
+                  <m:r>
+                    <m:t>4</m:t>
+                  </m:r>
+                </m:den>
+              </m:f>
+              <m:r>
+                <m:rPr>
+                  <m:sty m:val="p"/>
+                </m:rPr>
+                <m:t>=</m:t>
+              </m:r>
+              <m:r>
+                <m:rPr>
+                  <m:sty m:val="p"/>
+                </m:rPr>
+                <m:t>−</m:t>
+              </m:r>
+              <m:r>
+                <m:t>3</m:t>
+              </m:r>
+            </m:oMath>
+            <w:r>
+              <w:rPr>
+                <w:rtl/>
+              </w:rPr>
+              <w:t xml:space="preserve">:</w:t>
+            </w:r>
+            <w:r>
+              <w:rPr>
+                <w:rtl/>
+              </w:rPr>
+              <w:t xml:space="preserve"> </w:t>
+            </w:r>
+            <w:r>
+              <w:rPr>
+                <w:b/>
+                <w:bCs/>
+                <w:rtl/>
+              </w:rPr>
+              <w:t xml:space="preserve">نبسّط العدد قبل الحكم عليه</w:t>
+            </w:r>
+            <w:r>
+              <w:rPr>
+                <w:rtl/>
+              </w:rPr>
+              <w:t xml:space="preserve">.</w:t>
+            </w:r>
+          </w:p>
+          <w:p>
+            <w:pPr>
+              <w:numPr>
+                <w:ilvl w:val="0"/>
+                <w:numId w:val="1003"/>
+              </w:numPr>
+              <w:bidi/>
+              <w:jc w:val="left"/>
+            </w:pPr>
+            <m:oMath>
+              <m:r>
+                <m:t>0</m:t>
+              </m:r>
+              <m:r>
+                <m:rPr>
+                  <m:sty m:val="p"/>
+                </m:rPr>
+                <m:t>,</m:t>
+              </m:r>
+              <m:r>
+                <m:t>25</m:t>
+              </m:r>
+              <m:r>
+                <m:rPr>
+                  <m:sty m:val="p"/>
+                </m:rPr>
+                <m:t>=</m:t>
+              </m:r>
+              <m:f>
+                <m:fPr>
+                  <m:type m:val="bar"/>
+                </m:fPr>
+                <m:num>
+                  <m:r>
+                    <m:t>25</m:t>
+                  </m:r>
+                </m:num>
+                <m:den>
+                  <m:r>
+                    <m:t>100</m:t>
+                  </m:r>
+                </m:den>
+              </m:f>
+            </m:oMath>
+            <w:r>
+              <w:rPr>
+                <w:rtl/>
+              </w:rPr>
+              <w:t xml:space="preserve"> </w:t>
+            </w:r>
+            <w:r>
+              <w:rPr>
+                <w:rtl/>
+              </w:rPr>
+              <w:t xml:space="preserve">عشري ؛</w:t>
+            </w:r>
+            <w:r>
+              <w:rPr>
+                <w:rtl/>
+              </w:rPr>
+              <w:t xml:space="preserve"> </w:t>
+            </w:r>
+            <m:oMath>
+              <m:f>
+                <m:fPr>
+                  <m:type m:val="bar"/>
+                </m:fPr>
+                <m:num>
+                  <m:r>
+                    <m:t>2</m:t>
+                  </m:r>
+                </m:num>
+                <m:den>
+                  <m:r>
+                    <m:t>3</m:t>
+                  </m:r>
+                </m:den>
+              </m:f>
+              <m:r>
+                <m:rPr>
+                  <m:sty m:val="p"/>
+                </m:rPr>
+                <m:t>=</m:t>
+              </m:r>
+              <m:r>
+                <m:t>0</m:t>
+              </m:r>
+              <m:r>
+                <m:rPr>
+                  <m:sty m:val="p"/>
+                </m:rPr>
+                <m:t>,</m:t>
+              </m:r>
+              <m:r>
+                <m:t>666</m:t>
+              </m:r>
+              <m:r>
+                <m:rPr>
+                  <m:sty m:val="p"/>
+                </m:rPr>
+                <m:t>…</m:t>
+              </m:r>
+            </m:oMath>
+            <w:r>
+              <w:rPr>
+                <w:rtl/>
+              </w:rPr>
+              <w:t xml:space="preserve"> </w:t>
+            </w:r>
+            <w:r>
+              <w:rPr>
+                <w:rtl/>
+              </w:rPr>
+              <w:t xml:space="preserve">ليس عشرياً (الكتابة العشرية غير منتهية) لكنه ناطق.</w:t>
+            </w:r>
+          </w:p>
+          <w:p>
+            <w:pPr>
+              <w:numPr>
+                <w:ilvl w:val="0"/>
+                <w:numId w:val="1003"/>
+              </w:numPr>
+              <w:bidi/>
+              <w:jc w:val="left"/>
+            </w:pPr>
+            <m:oMath>
+              <m:rad>
+                <m:radPr>
+                  <m:degHide m:val="on"/>
+                </m:radPr>
+                <m:deg/>
+                <m:e>
+                  <m:r>
+                    <m:t>2</m:t>
+                  </m:r>
+                </m:e>
+              </m:rad>
+            </m:oMath>
+            <w:r>
+              <w:rPr>
+                <w:rtl/>
+              </w:rPr>
+              <w:t xml:space="preserve"> </w:t>
+            </w:r>
+            <w:r>
+              <w:rPr>
+                <w:rtl/>
+              </w:rPr>
+              <w:t xml:space="preserve">و</w:t>
+            </w:r>
+            <w:r>
+              <w:rPr>
+                <w:rtl/>
+              </w:rPr>
+              <w:t xml:space="preserve"> </w:t>
+            </w:r>
+            <m:oMath>
+              <m:r>
+                <m:t>π</m:t>
+              </m:r>
+            </m:oMath>
+            <w:r>
+              <w:rPr>
+                <w:rtl/>
+              </w:rPr>
+              <w:t xml:space="preserve"> </w:t>
+            </w:r>
+            <w:r>
+              <w:rPr>
+                <w:rtl/>
+              </w:rPr>
+              <w:t xml:space="preserve">ليسا ناطقين (نقبل ذلك الآن ، وبرهان</w:t>
+            </w:r>
+            <w:r>
+              <w:rPr>
+                <w:rtl/>
+              </w:rPr>
+              <w:t xml:space="preserve"> </w:t>
+            </w:r>
+            <m:oMath>
+              <m:rad>
+                <m:radPr>
+                  <m:degHide m:val="on"/>
+                </m:radPr>
+                <m:deg/>
+                <m:e>
+                  <m:r>
+                    <m:t>2</m:t>
+                  </m:r>
+                </m:e>
+              </m:rad>
+              <m:r>
+                <m:rPr>
+                  <m:sty m:val="p"/>
+                </m:rPr>
+                <m:t>∉</m:t>
+              </m:r>
+              <m:r>
+                <m:rPr>
+                  <m:sty m:val="p"/>
+                  <m:scr m:val="double-struck"/>
+                </m:rPr>
+                <m:t>Q</m:t>
+              </m:r>
+            </m:oMath>
+            <w:r>
+              <w:rPr>
+                <w:rtl/>
+              </w:rPr>
+              <w:t xml:space="preserve"> </w:t>
+            </w:r>
+            <w:r>
+              <w:rPr>
+                <w:rtl/>
+              </w:rPr>
+              <w:t xml:space="preserve">في حصة البرهان بالخلف).</w:t>
+            </w:r>
+          </w:p>
+          <w:p>
+            <w:pPr>
+              <w:numPr>
+                <w:ilvl w:val="0"/>
+                <w:numId w:val="1003"/>
+              </w:numPr>
+              <w:bidi/>
+              <w:jc w:val="left"/>
+            </w:pPr>
+            <w:r>
+              <w:rPr>
+                <w:rtl/>
+              </w:rPr>
+              <w:t xml:space="preserve">كل عدد طبيعي هو صحيح نسبي ، وكل صحيح نسبي عشري ،</w:t>
+            </w:r>
+            <w:r>
+              <w:rPr>
+                <w:rtl/>
+              </w:rPr>
+              <w:t xml:space="preserve"> </w:t>
+            </w:r>
+            <m:oMath>
+              <m:r>
+                <m:rPr>
+                  <m:sty m:val="p"/>
+                </m:rPr>
+                <m:t>…</m:t>
+              </m:r>
+            </m:oMath>
+          </w:p>
+        </w:tc>
+        <w:tc>
+          <w:tcPr>
+            <w:shd w:val="clear" w:color="auto" w:fill="E4E7ED"/>
+          </w:tcPr>
+          <w:p>
+            <w:pPr>
+              <w:pStyle w:val="Compact"/>
+              <w:bidi/>
+              <w:jc w:val="left"/>
+            </w:pPr>
+            <w:r>
+              <w:rPr>
+                <w:rtl/>
+              </w:rPr>
+              <w:t xml:space="preserve"/>
+            </w:r>
+            <w:r>
+              <w:rPr>
+                <w:b/>
+                <w:bCs/>
+                <w:rtl/>
+              </w:rPr>
+              <w:t xml:space="preserve">مناقشة النشاط</w:t>
+            </w:r>
+          </w:p>
+        </w:tc>
+      </w:tr>
+      <w:tr>
+        <w:tc>
+          <w:tcPr/>
+          <w:p>
+            <w:pPr>
+              <w:pStyle w:val="Compact"/>
+              <w:bidi/>
+              <w:jc w:val="left"/>
+            </w:pPr>
+            <w:r>
+              <w:rPr>
+                <w:rtl/>
+              </w:rPr>
+              <w:t xml:space="preserve">تُدوَّن في الكراريس. نرسم مخطط المجموعات المتداخلة على السبورة.</w:t>
+            </w:r>
+          </w:p>
+        </w:tc>
+        <w:tc>
+          <w:tcPr/>
+          <w:p>
+            <w:pPr>
+              <w:pStyle w:val="Compact"/>
+              <w:bidi/>
+              <w:jc w:val="left"/>
+            </w:pPr>
+            <w:r>
+              <w:rPr>
+                <w:rtl/>
+              </w:rPr>
+              <w:t xml:space="preserve">12 د</w:t>
+            </w:r>
+          </w:p>
+        </w:tc>
+        <w:tc>
+          <w:tcPr/>
+          <w:p>
+            <w:pPr>
+              <w:numPr>
+                <w:ilvl w:val="0"/>
+                <w:numId w:val="1004"/>
+              </w:numPr>
+              <w:bidi/>
+              <w:jc w:val="left"/>
+            </w:pPr>
+            <m:oMath>
+              <m:r>
+                <m:rPr>
+                  <m:sty m:val="p"/>
+                  <m:scr m:val="double-struck"/>
+                </m:rPr>
+                <m:t>N</m:t>
+              </m:r>
+              <m:r>
+                <m:rPr>
+                  <m:sty m:val="p"/>
+                </m:rPr>
+                <m:t>=</m:t>
+              </m:r>
+              <m:r>
+                <m:rPr>
+                  <m:sty m:val="p"/>
+                </m:rPr>
+                <m:t>{</m:t>
+              </m:r>
+              <m:r>
+                <m:t>0</m:t>
+              </m:r>
+              <m:r>
+                <m:rPr>
+                  <m:sty m:val="p"/>
+                </m:rPr>
+                <m:t>;</m:t>
+              </m:r>
+              <m:r>
+                <m:t>1</m:t>
+              </m:r>
+              <m:r>
+                <m:rPr>
+                  <m:sty m:val="p"/>
+                </m:rPr>
+                <m:t>;</m:t>
+              </m:r>
+              <m:r>
+                <m:t>2</m:t>
+              </m:r>
+              <m:r>
+                <m:rPr>
+                  <m:sty m:val="p"/>
+                </m:rPr>
+                <m:t>;</m:t>
+              </m:r>
+              <m:r>
+                <m:rPr>
+                  <m:sty m:val="p"/>
+                </m:rPr>
+                <m:t>…</m:t>
+              </m:r>
+              <m:r>
+                <m:rPr>
+                  <m:sty m:val="p"/>
+                </m:rPr>
+                <m:t>}</m:t>
+              </m:r>
+            </m:oMath>
+            <w:r>
+              <w:rPr>
+                <w:rtl/>
+              </w:rPr>
+              <w:t xml:space="preserve">: مجموعة</w:t>
+            </w:r>
+            <w:r>
+              <w:rPr>
+                <w:rtl/>
+              </w:rPr>
+              <w:t xml:space="preserve"> </w:t>
+            </w:r>
+            <w:r>
+              <w:rPr>
+                <w:b/>
+                <w:bCs/>
+                <w:rtl/>
+              </w:rPr>
+              <w:t xml:space="preserve">الأعداد الطبيعية</w:t>
+            </w:r>
+            <w:r>
+              <w:rPr>
+                <w:rtl/>
+              </w:rPr>
+              <w:t xml:space="preserve">.</w:t>
+            </w:r>
+          </w:p>
+          <w:p>
+            <w:pPr>
+              <w:numPr>
+                <w:ilvl w:val="0"/>
+                <w:numId w:val="1004"/>
+              </w:numPr>
+              <w:bidi/>
+              <w:jc w:val="left"/>
+            </w:pPr>
+            <m:oMath>
+              <m:r>
+                <m:rPr>
+                  <m:sty m:val="p"/>
+                  <m:scr m:val="double-struck"/>
+                </m:rPr>
+                <m:t>Z</m:t>
+              </m:r>
+              <m:r>
+                <m:rPr>
+                  <m:sty m:val="p"/>
+                </m:rPr>
+                <m:t>=</m:t>
+              </m:r>
+              <m:r>
+                <m:rPr>
+                  <m:sty m:val="p"/>
+                </m:rPr>
+                <m:t>{</m:t>
+              </m:r>
+              <m:r>
+                <m:rPr>
+                  <m:sty m:val="p"/>
+                </m:rPr>
+                <m:t>…</m:t>
+              </m:r>
+              <m:r>
+                <m:rPr>
+                  <m:sty m:val="p"/>
+                </m:rPr>
+                <m:t>;</m:t>
+              </m:r>
+              <m:r>
+                <m:rPr>
+                  <m:sty m:val="p"/>
+                </m:rPr>
+                <m:t>−</m:t>
+              </m:r>
+              <m:r>
+                <m:t>2</m:t>
+              </m:r>
+              <m:r>
+                <m:rPr>
+                  <m:sty m:val="p"/>
+                </m:rPr>
+                <m:t>;</m:t>
+              </m:r>
+              <m:r>
+                <m:rPr>
+                  <m:sty m:val="p"/>
+                </m:rPr>
+                <m:t>−</m:t>
+              </m:r>
+              <m:r>
+                <m:t>1</m:t>
+              </m:r>
+              <m:r>
+                <m:rPr>
+                  <m:sty m:val="p"/>
+                </m:rPr>
+                <m:t>;</m:t>
+              </m:r>
+              <m:r>
+                <m:t>0</m:t>
+              </m:r>
+              <m:r>
+                <m:rPr>
+                  <m:sty m:val="p"/>
+                </m:rPr>
+                <m:t>;</m:t>
+              </m:r>
+              <m:r>
+                <m:t>1</m:t>
+              </m:r>
+              <m:r>
+                <m:rPr>
+                  <m:sty m:val="p"/>
+                </m:rPr>
+                <m:t>;</m:t>
+              </m:r>
+              <m:r>
+                <m:t>2</m:t>
+              </m:r>
+              <m:r>
+                <m:rPr>
+                  <m:sty m:val="p"/>
+                </m:rPr>
+                <m:t>;</m:t>
+              </m:r>
+              <m:r>
+                <m:rPr>
+                  <m:sty m:val="p"/>
+                </m:rPr>
+                <m:t>…</m:t>
+              </m:r>
+              <m:r>
+                <m:rPr>
+                  <m:sty m:val="p"/>
+                </m:rPr>
+                <m:t>}</m:t>
+              </m:r>
+            </m:oMath>
+            <w:r>
+              <w:rPr>
+                <w:rtl/>
+              </w:rPr>
+              <w:t xml:space="preserve">: مجموعة</w:t>
+            </w:r>
+            <w:r>
+              <w:rPr>
+                <w:rtl/>
+              </w:rPr>
+              <w:t xml:space="preserve"> </w:t>
+            </w:r>
+            <w:r>
+              <w:rPr>
+                <w:b/>
+                <w:bCs/>
+                <w:rtl/>
+              </w:rPr>
+              <w:t xml:space="preserve">الأعداد الصحيحة النسبية</w:t>
+            </w:r>
+            <w:r>
+              <w:rPr>
+                <w:rtl/>
+              </w:rPr>
+              <w:t xml:space="preserve">.</w:t>
+            </w:r>
+          </w:p>
+          <w:p>
+            <w:pPr>
+              <w:numPr>
+                <w:ilvl w:val="0"/>
+                <w:numId w:val="1004"/>
+              </w:numPr>
+              <w:bidi/>
+              <w:jc w:val="left"/>
+            </w:pPr>
+            <m:oMath>
+              <m:r>
+                <m:rPr>
+                  <m:sty m:val="p"/>
+                  <m:scr m:val="double-struck"/>
+                </m:rPr>
+                <m:t>D</m:t>
+              </m:r>
+            </m:oMath>
+            <w:r>
+              <w:rPr>
+                <w:rtl/>
+              </w:rPr>
+              <w:t xml:space="preserve">: مجموعة</w:t>
+            </w:r>
+            <w:r>
+              <w:rPr>
+                <w:rtl/>
+              </w:rPr>
+              <w:t xml:space="preserve"> </w:t>
+            </w:r>
+            <w:r>
+              <w:rPr>
+                <w:b/>
+                <w:bCs/>
+                <w:rtl/>
+              </w:rPr>
+              <w:t xml:space="preserve">الأعداد العشرية</w:t>
+            </w:r>
+            <w:r>
+              <w:rPr>
+                <w:rtl/>
+              </w:rPr>
+              <w:t xml:space="preserve"> </w:t>
+            </w:r>
+            <w:r>
+              <w:rPr>
+                <w:rtl/>
+              </w:rPr>
+              <w:t xml:space="preserve">، أي الأعداد التي تُكتب</w:t>
+            </w:r>
+            <w:r>
+              <w:rPr>
+                <w:rtl/>
+              </w:rPr>
+              <w:t xml:space="preserve"> </w:t>
+            </w:r>
+            <m:oMath>
+              <m:f>
+                <m:fPr>
+                  <m:type m:val="bar"/>
+                </m:fPr>
+                <m:num>
+                  <m:r>
+                    <m:t>a</m:t>
+                  </m:r>
+                </m:num>
+                <m:den>
+                  <m:sSup>
+                    <m:e>
+                      <m:r>
+                        <m:t>10</m:t>
+                      </m:r>
+                    </m:e>
+                    <m:sup>
+                      <m:r>
+                        <m:t>n</m:t>
+                      </m:r>
+                    </m:sup>
+                  </m:sSup>
+                </m:den>
+              </m:f>
+            </m:oMath>
+            <w:r>
+              <w:rPr>
+                <w:rtl/>
+              </w:rPr>
+              <w:t xml:space="preserve"> </w:t>
+            </w:r>
+            <w:r>
+              <w:rPr>
+                <w:rtl/>
+              </w:rPr>
+              <w:t xml:space="preserve">حيث</w:t>
+            </w:r>
+            <w:r>
+              <w:rPr>
+                <w:rtl/>
+              </w:rPr>
+              <w:t xml:space="preserve"> </w:t>
+            </w:r>
+            <m:oMath>
+              <m:r>
+                <m:t>a</m:t>
+              </m:r>
+              <m:r>
+                <m:rPr>
+                  <m:sty m:val="p"/>
+                </m:rPr>
+                <m:t>∈</m:t>
+              </m:r>
+              <m:r>
+                <m:rPr>
+                  <m:sty m:val="p"/>
+                  <m:scr m:val="double-struck"/>
+                </m:rPr>
+                <m:t>Z</m:t>
+              </m:r>
+            </m:oMath>
+            <w:r>
+              <w:rPr>
+                <w:rtl/>
+              </w:rPr>
+              <w:t xml:space="preserve"> </w:t>
+            </w:r>
+            <w:r>
+              <w:rPr>
+                <w:rtl/>
+              </w:rPr>
+              <w:t xml:space="preserve">و</w:t>
+            </w:r>
+            <w:r>
+              <w:rPr>
+                <w:rtl/>
+              </w:rPr>
+              <w:t xml:space="preserve"> </w:t>
+            </w:r>
+            <m:oMath>
+              <m:r>
+                <m:t>n</m:t>
+              </m:r>
+              <m:r>
+                <m:rPr>
+                  <m:sty m:val="p"/>
+                </m:rPr>
+                <m:t>∈</m:t>
+              </m:r>
+              <m:r>
+                <m:rPr>
+                  <m:sty m:val="p"/>
+                  <m:scr m:val="double-struck"/>
+                </m:rPr>
+                <m:t>N</m:t>
+              </m:r>
+            </m:oMath>
+            <w:r>
+              <w:rPr>
+                <w:rtl/>
+              </w:rPr>
+              <w:t xml:space="preserve">.</w:t>
+            </w:r>
+          </w:p>
+          <w:p>
+            <w:pPr>
+              <w:numPr>
+                <w:ilvl w:val="0"/>
+                <w:numId w:val="1004"/>
+              </w:numPr>
+              <w:bidi/>
+              <w:jc w:val="left"/>
+            </w:pPr>
+            <m:oMath>
+              <m:r>
+                <m:rPr>
+                  <m:sty m:val="p"/>
+                  <m:scr m:val="double-struck"/>
+                </m:rPr>
+                <m:t>Q</m:t>
+              </m:r>
+            </m:oMath>
+            <w:r>
+              <w:rPr>
+                <w:rtl/>
+              </w:rPr>
+              <w:t xml:space="preserve">: مجموعة</w:t>
+            </w:r>
+            <w:r>
+              <w:rPr>
+                <w:rtl/>
+              </w:rPr>
+              <w:t xml:space="preserve"> </w:t>
+            </w:r>
+            <w:r>
+              <w:rPr>
+                <w:b/>
+                <w:bCs/>
+                <w:rtl/>
+              </w:rPr>
+              <w:t xml:space="preserve">الأعداد الناطقة</w:t>
+            </w:r>
+            <w:r>
+              <w:rPr>
+                <w:rtl/>
+              </w:rPr>
+              <w:t xml:space="preserve"> </w:t>
+            </w:r>
+            <w:r>
+              <w:rPr>
+                <w:rtl/>
+              </w:rPr>
+              <w:t xml:space="preserve">، أي الأعداد التي تُكتب</w:t>
+            </w:r>
+            <w:r>
+              <w:rPr>
+                <w:rtl/>
+              </w:rPr>
+              <w:t xml:space="preserve"> </w:t>
+            </w:r>
+            <m:oMath>
+              <m:f>
+                <m:fPr>
+                  <m:type m:val="bar"/>
+                </m:fPr>
+                <m:num>
+                  <m:r>
+                    <m:t>a</m:t>
+                  </m:r>
+                </m:num>
+                <m:den>
+                  <m:r>
+                    <m:t>b</m:t>
+                  </m:r>
+                </m:den>
+              </m:f>
+            </m:oMath>
+            <w:r>
+              <w:rPr>
+                <w:rtl/>
+              </w:rPr>
+              <w:t xml:space="preserve"> </w:t>
+            </w:r>
+            <w:r>
+              <w:rPr>
+                <w:rtl/>
+              </w:rPr>
+              <w:t xml:space="preserve">حيث</w:t>
+            </w:r>
+            <w:r>
+              <w:rPr>
+                <w:rtl/>
+              </w:rPr>
+              <w:t xml:space="preserve"> </w:t>
+            </w:r>
+            <m:oMath>
+              <m:r>
+                <m:t>a</m:t>
+              </m:r>
+              <m:r>
+                <m:rPr>
+                  <m:sty m:val="p"/>
+                </m:rPr>
+                <m:t>∈</m:t>
+              </m:r>
+              <m:r>
+                <m:rPr>
+                  <m:sty m:val="p"/>
+                  <m:scr m:val="double-struck"/>
+                </m:rPr>
+                <m:t>Z</m:t>
+              </m:r>
+            </m:oMath>
+            <w:r>
+              <w:rPr>
+                <w:rtl/>
+              </w:rPr>
+              <w:t xml:space="preserve"> </w:t>
+            </w:r>
+            <w:r>
+              <w:rPr>
+                <w:rtl/>
+              </w:rPr>
+              <w:t xml:space="preserve">و</w:t>
+            </w:r>
+            <w:r>
+              <w:rPr>
+                <w:rtl/>
+              </w:rPr>
+              <w:t xml:space="preserve"> </w:t>
+            </w:r>
+            <m:oMath>
+              <m:r>
+                <m:t>b</m:t>
+              </m:r>
+              <m:r>
+                <m:rPr>
+                  <m:sty m:val="p"/>
+                </m:rPr>
+                <m:t>∈</m:t>
+              </m:r>
+              <m:sSup>
+                <m:e>
+                  <m:r>
+                    <m:rPr>
+                      <m:sty m:val="p"/>
+                      <m:scr m:val="double-struck"/>
+                    </m:rPr>
+                    <m:t>Z</m:t>
+                  </m:r>
+                </m:e>
+                <m:sup>
+                  <m:r>
+                    <m:rPr>
+                      <m:sty m:val="p"/>
+                    </m:rPr>
+                    <m:t>*</m:t>
+                  </m:r>
+                </m:sup>
+              </m:sSup>
+            </m:oMath>
+            <w:r>
+              <w:rPr>
+                <w:rtl/>
+              </w:rPr>
+              <w:t xml:space="preserve">.</w:t>
+            </w:r>
+          </w:p>
+          <w:p>
+            <w:pPr>
+              <w:numPr>
+                <w:ilvl w:val="0"/>
+                <w:numId w:val="1004"/>
+              </w:numPr>
+              <w:bidi/>
+              <w:jc w:val="left"/>
+            </w:pPr>
+            <m:oMath>
+              <m:r>
+                <m:rPr>
+                  <m:sty m:val="p"/>
+                  <m:scr m:val="double-struck"/>
+                </m:rPr>
+                <m:t>R</m:t>
+              </m:r>
+            </m:oMath>
+            <w:r>
+              <w:rPr>
+                <w:rtl/>
+              </w:rPr>
+              <w:t xml:space="preserve">: مجموعة</w:t>
+            </w:r>
+            <w:r>
+              <w:rPr>
+                <w:rtl/>
+              </w:rPr>
+              <w:t xml:space="preserve"> </w:t>
+            </w:r>
+            <w:r>
+              <w:rPr>
+                <w:b/>
+                <w:bCs/>
+                <w:rtl/>
+              </w:rPr>
+              <w:t xml:space="preserve">الأعداد الحقيقية</w:t>
+            </w:r>
+            <w:r>
+              <w:rPr>
+                <w:rtl/>
+              </w:rPr>
+              <w:t xml:space="preserve"> </w:t>
+            </w:r>
+            <w:r>
+              <w:rPr>
+                <w:rtl/>
+              </w:rPr>
+              <w:t xml:space="preserve">(فواصل نقط المستقيم العددي). العدد الحقيقي غير الناطق يسمى</w:t>
+            </w:r>
+            <w:r>
+              <w:rPr>
+                <w:rtl/>
+              </w:rPr>
+              <w:t xml:space="preserve"> </w:t>
+            </w:r>
+            <w:r>
+              <w:rPr>
+                <w:b/>
+                <w:bCs/>
+                <w:rtl/>
+              </w:rPr>
+              <w:t xml:space="preserve">أصمّ</w:t>
+            </w:r>
+            <w:r>
+              <w:rPr>
+                <w:rtl/>
+              </w:rPr>
+              <w:t xml:space="preserve">.</w:t>
+            </w:r>
+          </w:p>
+          <w:p>
+            <w:pPr>
+              <w:bidi/>
+              <w:jc w:val="left"/>
+            </w:pPr>
+            <w:r>
+              <w:rPr>
+                <w:b/>
+                <w:bCs/>
+                <w:rtl/>
+              </w:rPr>
+              <w:t xml:space="preserve">خاصية:</w:t>
+            </w:r>
+            <w:r>
+              <w:rPr>
+                <w:rtl/>
+              </w:rPr>
+              <w:t xml:space="preserve"> </w:t>
+            </w:r>
+            <m:oMath>
+              <m:borderBox>
+                <m:e>
+                  <m:r>
+                    <m:rPr>
+                      <m:sty m:val="p"/>
+                      <m:scr m:val="double-struck"/>
+                    </m:rPr>
+                    <m:t>N</m:t>
+                  </m:r>
+                  <m:r>
+                    <m:rPr>
+                      <m:sty m:val="p"/>
+                    </m:rPr>
+                    <m:t>⊂</m:t>
+                  </m:r>
+                  <m:r>
+                    <m:rPr>
+                      <m:sty m:val="p"/>
+                      <m:scr m:val="double-struck"/>
+                    </m:rPr>
+                    <m:t>Z</m:t>
+                  </m:r>
+                  <m:r>
+                    <m:rPr>
+                      <m:sty m:val="p"/>
+                    </m:rPr>
+                    <m:t>⊂</m:t>
+                  </m:r>
+                  <m:r>
+                    <m:rPr>
+                      <m:sty m:val="p"/>
+                      <m:scr m:val="double-struck"/>
+                    </m:rPr>
+                    <m:t>D</m:t>
+                  </m:r>
+                  <m:r>
+                    <m:rPr>
+                      <m:sty m:val="p"/>
+                    </m:rPr>
+                    <m:t>⊂</m:t>
+                  </m:r>
+                  <m:r>
+                    <m:rPr>
+                      <m:sty m:val="p"/>
+                      <m:scr m:val="double-struck"/>
+                    </m:rPr>
+                    <m:t>Q</m:t>
+                  </m:r>
+                  <m:r>
+                    <m:rPr>
+                      <m:sty m:val="p"/>
+                    </m:rPr>
+                    <m:t>⊂</m:t>
+                  </m:r>
+                  <m:r>
+                    <m:rPr>
+                      <m:sty m:val="p"/>
+                      <m:scr m:val="double-struck"/>
+                    </m:rPr>
+                    <m:t>R</m:t>
+                  </m:r>
+                </m:e>
+              </m:borderBox>
+            </m:oMath>
+            <w:r>
+              <w:rPr>
+                <w:rtl/>
+              </w:rPr>
+              <w:t xml:space="preserve">.  </w:t>
+            </w:r>
+            <w:r>
+              <w:rPr>
+                <w:rtl/>
+              </w:rPr>
+              <w:t xml:space="preserve"> </w:t>
+            </w:r>
+            <w:r>
+              <w:rPr>
+                <w:b/>
+                <w:bCs/>
+                <w:rtl/>
+              </w:rPr>
+              <w:t xml:space="preserve">ترميز:</w:t>
+            </w:r>
+            <w:r>
+              <w:rPr>
+                <w:rtl/>
+              </w:rPr>
+              <w:t xml:space="preserve"> </w:t>
+            </w:r>
+            <m:oMath>
+              <m:r>
+                <m:t>3</m:t>
+              </m:r>
+              <m:r>
+                <m:rPr>
+                  <m:sty m:val="p"/>
+                </m:rPr>
+                <m:t>∈</m:t>
+              </m:r>
+              <m:r>
+                <m:rPr>
+                  <m:sty m:val="p"/>
+                  <m:scr m:val="double-struck"/>
+                </m:rPr>
+                <m:t>N</m:t>
+              </m:r>
+            </m:oMath>
+            <w:r>
+              <w:rPr>
+                <w:rtl/>
+              </w:rPr>
+              <w:t xml:space="preserve"> </w:t>
+            </w:r>
+            <w:r>
+              <w:rPr>
+                <w:rtl/>
+              </w:rPr>
+              <w:t xml:space="preserve">،</w:t>
+            </w:r>
+            <w:r>
+              <w:rPr>
+                <w:rtl/>
+              </w:rPr>
+              <w:t xml:space="preserve"> </w:t>
+            </w:r>
+            <m:oMath>
+              <m:f>
+                <m:fPr>
+                  <m:type m:val="bar"/>
+                </m:fPr>
+                <m:num>
+                  <m:r>
+                    <m:t>2</m:t>
+                  </m:r>
+                </m:num>
+                <m:den>
+                  <m:r>
+                    <m:t>3</m:t>
+                  </m:r>
+                </m:den>
+              </m:f>
+              <m:r>
+                <m:rPr>
+                  <m:sty m:val="p"/>
+                </m:rPr>
+                <m:t>∉</m:t>
+              </m:r>
+              <m:r>
+                <m:rPr>
+                  <m:sty m:val="p"/>
+                  <m:scr m:val="double-struck"/>
+                </m:rPr>
+                <m:t>D</m:t>
+              </m:r>
+            </m:oMath>
+            <w:r>
+              <w:rPr>
+                <w:rtl/>
+              </w:rPr>
+              <w:t xml:space="preserve"> </w:t>
+            </w:r>
+            <w:r>
+              <w:rPr>
+                <w:rtl/>
+              </w:rPr>
+              <w:t xml:space="preserve">،</w:t>
+            </w:r>
+            <w:r>
+              <w:rPr>
+                <w:rtl/>
+              </w:rPr>
+              <w:t xml:space="preserve"> </w:t>
+            </w:r>
+            <m:oMath>
+              <m:sSup>
+                <m:e>
+                  <m:r>
+                    <m:rPr>
+                      <m:sty m:val="p"/>
+                      <m:scr m:val="double-struck"/>
+                    </m:rPr>
+                    <m:t>R</m:t>
+                  </m:r>
+                </m:e>
+                <m:sup>
+                  <m:r>
+                    <m:rPr>
+                      <m:sty m:val="p"/>
+                    </m:rPr>
+                    <m:t>*</m:t>
+                  </m:r>
+                </m:sup>
+              </m:sSup>
+              <m:r>
+                <m:rPr>
+                  <m:sty m:val="p"/>
+                </m:rPr>
+                <m:t>=</m:t>
+              </m:r>
+              <m:r>
+                <m:rPr>
+                  <m:sty m:val="p"/>
+                  <m:scr m:val="double-struck"/>
+                </m:rPr>
+                <m:t>R</m:t>
+              </m:r>
+              <m:r>
+                <m:rPr>
+                  <m:sty m:val="p"/>
+                </m:rPr>
+                <m:t>−</m:t>
+              </m:r>
+              <m:r>
+                <m:rPr>
+                  <m:sty m:val="p"/>
+                </m:rPr>
+                <m:t>{</m:t>
+              </m:r>
+              <m:r>
+                <m:t>0</m:t>
+              </m:r>
+              <m:r>
+                <m:rPr>
+                  <m:sty m:val="p"/>
+                </m:rPr>
+                <m:t>}</m:t>
+              </m:r>
+            </m:oMath>
+            <w:r>
+              <w:rPr>
+                <w:rtl/>
+              </w:rPr>
+              <w:t xml:space="preserve"> </w:t>
+            </w:r>
+            <w:r>
+              <w:rPr>
+                <w:rtl/>
+              </w:rPr>
+              <w:t xml:space="preserve">،</w:t>
+            </w:r>
+            <w:r>
+              <w:rPr>
+                <w:rtl/>
+              </w:rPr>
+              <w:t xml:space="preserve"> </w:t>
+            </w:r>
+            <m:oMath>
+              <m:sSub>
+                <m:e>
+                  <m:r>
+                    <m:rPr>
+                      <m:sty m:val="p"/>
+                      <m:scr m:val="double-struck"/>
+                    </m:rPr>
+                    <m:t>R</m:t>
+                  </m:r>
+                </m:e>
+                <m:sub>
+                  <m:r>
+                    <m:rPr>
+                      <m:sty m:val="p"/>
+                    </m:rPr>
+                    <m:t>+</m:t>
+                  </m:r>
+                </m:sub>
+              </m:sSub>
+            </m:oMath>
+            <w:r>
+              <w:rPr>
+                <w:rtl/>
+              </w:rPr>
+              <w:t xml:space="preserve"> </w:t>
+            </w:r>
+            <w:r>
+              <w:rPr>
+                <w:rtl/>
+              </w:rPr>
+              <w:t xml:space="preserve">،</w:t>
+            </w:r>
+            <w:r>
+              <w:rPr>
+                <w:rtl/>
+              </w:rPr>
+              <w:t xml:space="preserve"> </w:t>
+            </w:r>
+            <m:oMath>
+              <m:sSub>
+                <m:e>
+                  <m:r>
+                    <m:rPr>
+                      <m:sty m:val="p"/>
+                      <m:scr m:val="double-struck"/>
+                    </m:rPr>
+                    <m:t>R</m:t>
+                  </m:r>
+                </m:e>
+                <m:sub>
+                  <m:r>
+                    <m:rPr>
+                      <m:sty m:val="p"/>
+                    </m:rPr>
+                    <m:t>−</m:t>
+                  </m:r>
+                </m:sub>
+              </m:sSub>
+            </m:oMath>
+            <w:r>
+              <w:rPr>
+                <w:rtl/>
+              </w:rPr>
+              <w:t xml:space="preserve">.</w:t>
+            </w:r>
+          </w:p>
+        </w:tc>
+        <w:tc>
+          <w:tcPr>
+            <w:shd w:val="clear" w:color="auto" w:fill="E4E7ED"/>
+          </w:tcPr>
+          <w:p>
+            <w:pPr>
+              <w:pStyle w:val="Compact"/>
+              <w:bidi/>
+              <w:jc w:val="left"/>
+            </w:pPr>
+            <w:r>
+              <w:rPr>
+                <w:rtl/>
+              </w:rPr>
+              <w:t xml:space="preserve"/>
+            </w:r>
+            <w:r>
+              <w:rPr>
+                <w:b/>
+                <w:bCs/>
+                <w:rtl/>
+              </w:rPr>
+              <w:t xml:space="preserve">بناء التعلّمات: تعاريف</w:t>
+            </w:r>
+          </w:p>
+        </w:tc>
+      </w:tr>
+      <w:tr>
+        <w:tc>
+          <w:tcPr/>
+          <w:p>
+            <w:pPr>
+              <w:pStyle w:val="Compact"/>
+              <w:bidi/>
+              <w:jc w:val="left"/>
+            </w:pPr>
+            <w:r>
+              <w:rPr>
+                <w:rtl/>
+              </w:rPr>
+              <w:t xml:space="preserve">نُشرك التلاميذ في تعليل كل انتماء.</w:t>
+            </w:r>
+          </w:p>
+        </w:tc>
+        <w:tc>
+          <w:tcPr/>
+          <w:p>
+            <w:pPr>
+              <w:pStyle w:val="Compact"/>
+              <w:bidi/>
+              <w:jc w:val="left"/>
+            </w:pPr>
+            <w:r>
+              <w:rPr>
+                <w:rtl/>
+              </w:rPr>
+              <w:t xml:space="preserve">8 د</w:t>
+            </w:r>
+          </w:p>
+        </w:tc>
+        <w:tc>
+          <w:tcPr/>
+          <w:p>
+            <w:pPr>
+              <w:numPr>
+                <w:ilvl w:val="0"/>
+                <w:numId w:val="1005"/>
+              </w:numPr>
+              <w:bidi/>
+              <w:jc w:val="left"/>
+            </w:pPr>
+            <m:oMath>
+              <m:f>
+                <m:fPr>
+                  <m:type m:val="bar"/>
+                </m:fPr>
+                <m:num>
+                  <m:r>
+                    <m:t>7</m:t>
+                  </m:r>
+                </m:num>
+                <m:den>
+                  <m:r>
+                    <m:t>4</m:t>
+                  </m:r>
+                </m:den>
+              </m:f>
+              <m:r>
+                <m:rPr>
+                  <m:sty m:val="p"/>
+                </m:rPr>
+                <m:t>=</m:t>
+              </m:r>
+              <m:r>
+                <m:t>1</m:t>
+              </m:r>
+              <m:r>
+                <m:rPr>
+                  <m:sty m:val="p"/>
+                </m:rPr>
+                <m:t>,</m:t>
+              </m:r>
+              <m:r>
+                <m:t>75</m:t>
+              </m:r>
+              <m:r>
+                <m:rPr>
+                  <m:sty m:val="p"/>
+                </m:rPr>
+                <m:t>=</m:t>
+              </m:r>
+              <m:f>
+                <m:fPr>
+                  <m:type m:val="bar"/>
+                </m:fPr>
+                <m:num>
+                  <m:r>
+                    <m:t>175</m:t>
+                  </m:r>
+                </m:num>
+                <m:den>
+                  <m:r>
+                    <m:t>100</m:t>
+                  </m:r>
+                </m:den>
+              </m:f>
+            </m:oMath>
+            <w:r>
+              <w:rPr>
+                <w:rtl/>
+              </w:rPr>
+              <w:t xml:space="preserve">: إذن</w:t>
+            </w:r>
+            <w:r>
+              <w:rPr>
+                <w:rtl/>
+              </w:rPr>
+              <w:t xml:space="preserve"> </w:t>
+            </w:r>
+            <m:oMath>
+              <m:f>
+                <m:fPr>
+                  <m:type m:val="bar"/>
+                </m:fPr>
+                <m:num>
+                  <m:r>
+                    <m:t>7</m:t>
+                  </m:r>
+                </m:num>
+                <m:den>
+                  <m:r>
+                    <m:t>4</m:t>
+                  </m:r>
+                </m:den>
+              </m:f>
+              <m:r>
+                <m:rPr>
+                  <m:sty m:val="p"/>
+                </m:rPr>
+                <m:t>∈</m:t>
+              </m:r>
+              <m:r>
+                <m:rPr>
+                  <m:sty m:val="p"/>
+                  <m:scr m:val="double-struck"/>
+                </m:rPr>
+                <m:t>D</m:t>
+              </m:r>
+            </m:oMath>
+            <w:r>
+              <w:rPr>
+                <w:rtl/>
+              </w:rPr>
+              <w:t xml:space="preserve">.</w:t>
+            </w:r>
+          </w:p>
+          <w:p>
+            <w:pPr>
+              <w:numPr>
+                <w:ilvl w:val="0"/>
+                <w:numId w:val="1005"/>
+              </w:numPr>
+              <w:bidi/>
+              <w:jc w:val="left"/>
+            </w:pPr>
+            <m:oMath>
+              <m:f>
+                <m:fPr>
+                  <m:type m:val="bar"/>
+                </m:fPr>
+                <m:num>
+                  <m:r>
+                    <m:t>1</m:t>
+                  </m:r>
+                </m:num>
+                <m:den>
+                  <m:r>
+                    <m:t>3</m:t>
+                  </m:r>
+                </m:den>
+              </m:f>
+              <m:r>
+                <m:rPr>
+                  <m:sty m:val="p"/>
+                </m:rPr>
+                <m:t>∈</m:t>
+              </m:r>
+              <m:r>
+                <m:rPr>
+                  <m:sty m:val="p"/>
+                  <m:scr m:val="double-struck"/>
+                </m:rPr>
+                <m:t>Q</m:t>
+              </m:r>
+            </m:oMath>
+            <w:r>
+              <w:rPr>
+                <w:rtl/>
+              </w:rPr>
+              <w:t xml:space="preserve"> </w:t>
+            </w:r>
+            <w:r>
+              <w:rPr>
+                <w:rtl/>
+              </w:rPr>
+              <w:t xml:space="preserve">و</w:t>
+            </w:r>
+            <w:r>
+              <w:rPr>
+                <w:rtl/>
+              </w:rPr>
+              <w:t xml:space="preserve"> </w:t>
+            </w:r>
+            <m:oMath>
+              <m:f>
+                <m:fPr>
+                  <m:type m:val="bar"/>
+                </m:fPr>
+                <m:num>
+                  <m:r>
+                    <m:t>1</m:t>
+                  </m:r>
+                </m:num>
+                <m:den>
+                  <m:r>
+                    <m:t>3</m:t>
+                  </m:r>
+                </m:den>
+              </m:f>
+              <m:r>
+                <m:rPr>
+                  <m:sty m:val="p"/>
+                </m:rPr>
+                <m:t>∉</m:t>
+              </m:r>
+              <m:r>
+                <m:rPr>
+                  <m:sty m:val="p"/>
+                  <m:scr m:val="double-struck"/>
+                </m:rPr>
+                <m:t>D</m:t>
+              </m:r>
+            </m:oMath>
+            <w:r>
+              <w:rPr>
+                <w:rtl/>
+              </w:rPr>
+              <w:t xml:space="preserve">.</w:t>
+            </w:r>
+          </w:p>
+          <w:p>
+            <w:pPr>
+              <w:numPr>
+                <w:ilvl w:val="0"/>
+                <w:numId w:val="1005"/>
+              </w:numPr>
+              <w:bidi/>
+              <w:jc w:val="left"/>
+            </w:pPr>
+            <m:oMath>
+              <m:r>
+                <m:rPr>
+                  <m:sty m:val="p"/>
+                </m:rPr>
+                <m:t>−</m:t>
+              </m:r>
+              <m:rad>
+                <m:radPr>
+                  <m:degHide m:val="on"/>
+                </m:radPr>
+                <m:deg/>
+                <m:e>
+                  <m:r>
+                    <m:t>16</m:t>
+                  </m:r>
+                </m:e>
+              </m:rad>
+              <m:r>
+                <m:rPr>
+                  <m:sty m:val="p"/>
+                </m:rPr>
+                <m:t>=</m:t>
+              </m:r>
+              <m:r>
+                <m:rPr>
+                  <m:sty m:val="p"/>
+                </m:rPr>
+                <m:t>−</m:t>
+              </m:r>
+              <m:r>
+                <m:t>4</m:t>
+              </m:r>
+              <m:r>
+                <m:rPr>
+                  <m:sty m:val="p"/>
+                </m:rPr>
+                <m:t>∈</m:t>
+              </m:r>
+              <m:r>
+                <m:rPr>
+                  <m:sty m:val="p"/>
+                  <m:scr m:val="double-struck"/>
+                </m:rPr>
+                <m:t>Z</m:t>
+              </m:r>
+            </m:oMath>
+            <w:r>
+              <w:rPr>
+                <w:rtl/>
+              </w:rPr>
+              <w:t xml:space="preserve"> </w:t>
+            </w:r>
+            <w:r>
+              <w:rPr>
+                <w:rtl/>
+              </w:rPr>
+              <w:t xml:space="preserve">و</w:t>
+            </w:r>
+            <w:r>
+              <w:rPr>
+                <w:rtl/>
+              </w:rPr>
+              <w:t xml:space="preserve"> </w:t>
+            </w:r>
+            <m:oMath>
+              <m:r>
+                <m:rPr>
+                  <m:sty m:val="p"/>
+                </m:rPr>
+                <m:t>−</m:t>
+              </m:r>
+              <m:r>
+                <m:t>4</m:t>
+              </m:r>
+              <m:r>
+                <m:rPr>
+                  <m:sty m:val="p"/>
+                </m:rPr>
+                <m:t>∉</m:t>
+              </m:r>
+              <m:r>
+                <m:rPr>
+                  <m:sty m:val="p"/>
+                  <m:scr m:val="double-struck"/>
+                </m:rPr>
+                <m:t>N</m:t>
+              </m:r>
+            </m:oMath>
+            <w:r>
+              <w:rPr>
+                <w:rtl/>
+              </w:rPr>
+              <w:t xml:space="preserve">.</w:t>
+            </w:r>
+          </w:p>
+          <w:p>
+            <w:pPr>
+              <w:numPr>
+                <w:ilvl w:val="0"/>
+                <w:numId w:val="1005"/>
+              </w:numPr>
+              <w:bidi/>
+              <w:jc w:val="left"/>
+            </w:pPr>
+            <m:oMath>
+              <m:r>
+                <m:t>1</m:t>
+              </m:r>
+              <m:r>
+                <m:rPr>
+                  <m:sty m:val="p"/>
+                </m:rPr>
+                <m:t>+</m:t>
+              </m:r>
+              <m:rad>
+                <m:radPr>
+                  <m:degHide m:val="on"/>
+                </m:radPr>
+                <m:deg/>
+                <m:e>
+                  <m:r>
+                    <m:t>2</m:t>
+                  </m:r>
+                </m:e>
+              </m:rad>
+              <m:r>
+                <m:rPr>
+                  <m:sty m:val="p"/>
+                </m:rPr>
+                <m:t>∉</m:t>
+              </m:r>
+              <m:r>
+                <m:rPr>
+                  <m:sty m:val="p"/>
+                  <m:scr m:val="double-struck"/>
+                </m:rPr>
+                <m:t>Q</m:t>
+              </m:r>
+            </m:oMath>
+            <w:r>
+              <w:rPr>
+                <w:rtl/>
+              </w:rPr>
+              <w:t xml:space="preserve"> </w:t>
+            </w:r>
+            <w:r>
+              <w:rPr>
+                <w:rtl/>
+              </w:rPr>
+              <w:t xml:space="preserve">، و</w:t>
+            </w:r>
+            <w:r>
+              <w:rPr>
+                <w:rtl/>
+              </w:rPr>
+              <w:t xml:space="preserve"> </w:t>
+            </w:r>
+            <m:oMath>
+              <m:r>
+                <m:t>1</m:t>
+              </m:r>
+              <m:r>
+                <m:rPr>
+                  <m:sty m:val="p"/>
+                </m:rPr>
+                <m:t>+</m:t>
+              </m:r>
+              <m:rad>
+                <m:radPr>
+                  <m:degHide m:val="on"/>
+                </m:radPr>
+                <m:deg/>
+                <m:e>
+                  <m:r>
+                    <m:t>2</m:t>
+                  </m:r>
+                </m:e>
+              </m:rad>
+              <m:r>
+                <m:rPr>
+                  <m:sty m:val="p"/>
+                </m:rPr>
+                <m:t>∈</m:t>
+              </m:r>
+              <m:r>
+                <m:rPr>
+                  <m:sty m:val="p"/>
+                  <m:scr m:val="double-struck"/>
+                </m:rPr>
+                <m:t>R</m:t>
+              </m:r>
+            </m:oMath>
+            <w:r>
+              <w:rPr>
+                <w:rtl/>
+              </w:rPr>
+              <w:t xml:space="preserve">.</w:t>
+            </w:r>
+          </w:p>
+        </w:tc>
+        <w:tc>
+          <w:tcPr>
+            <w:shd w:val="clear" w:color="auto" w:fill="E4E7ED"/>
+          </w:tcPr>
+          <w:p>
+            <w:pPr>
+              <w:pStyle w:val="Compact"/>
+              <w:bidi/>
+              <w:jc w:val="left"/>
+            </w:pPr>
+            <w:r>
+              <w:rPr>
+                <w:rtl/>
+              </w:rPr>
+              <w:t xml:space="preserve"/>
+            </w:r>
+            <w:r>
+              <w:rPr>
+                <w:b/>
+                <w:bCs/>
+                <w:rtl/>
+              </w:rPr>
+              <w:t xml:space="preserve">أمثلة</w:t>
+            </w:r>
+          </w:p>
+        </w:tc>
+      </w:tr>
+      <w:tr>
+        <w:tc>
+          <w:tcPr/>
+          <w:p>
+            <w:pPr>
+              <w:pStyle w:val="Compact"/>
+              <w:bidi/>
+              <w:jc w:val="left"/>
+            </w:pPr>
+            <w:r>
+              <w:rPr>
+                <w:rtl/>
+              </w:rPr>
+              <w:t xml:space="preserve">تقويم فردي سريع على الألواح ؛ نعالج الأخطاء الشائعة (</w:t>
+            </w:r>
+            <m:oMath>
+              <m:f>
+                <m:fPr>
+                  <m:type m:val="bar"/>
+                </m:fPr>
+                <m:num>
+                  <m:r>
+                    <m:t>5</m:t>
+                  </m:r>
+                </m:num>
+                <m:den>
+                  <m:r>
+                    <m:t>6</m:t>
+                  </m:r>
+                </m:den>
+              </m:f>
+            </m:oMath>
+            <w:r>
+              <w:rPr>
+                <w:rtl/>
+              </w:rPr>
+              <w:t xml:space="preserve"> </w:t>
+            </w:r>
+            <w:r>
+              <w:rPr>
+                <w:rtl/>
+              </w:rPr>
+              <w:t xml:space="preserve">ناطق لكنه غير عشري).</w:t>
+            </w:r>
+          </w:p>
+        </w:tc>
+        <w:tc>
+          <w:tcPr/>
+          <w:p>
+            <w:pPr>
+              <w:pStyle w:val="Compact"/>
+              <w:bidi/>
+              <w:jc w:val="left"/>
+            </w:pPr>
+            <w:r>
+              <w:rPr>
+                <w:rtl/>
+              </w:rPr>
+              <w:t xml:space="preserve">10 د</w:t>
+            </w:r>
+          </w:p>
+        </w:tc>
+        <w:tc>
+          <w:tcPr/>
+          <w:p>
+            <w:pPr>
+              <w:bidi/>
+              <w:jc w:val="left"/>
+            </w:pPr>
+            <w:r>
+              <w:rPr>
+                <w:b/>
+                <w:bCs/>
+                <w:rtl/>
+              </w:rPr>
+              <w:t xml:space="preserve">تمرين:</w:t>
+            </w:r>
+            <w:r>
+              <w:rPr>
+                <w:rtl/>
+              </w:rPr>
+              <w:t xml:space="preserve"> </w:t>
+            </w:r>
+            <w:r>
+              <w:rPr>
+                <w:rtl/>
+              </w:rPr>
+              <w:t xml:space="preserve">أكمل بأحد الرمزين</w:t>
+            </w:r>
+            <w:r>
+              <w:rPr>
+                <w:rtl/>
+              </w:rPr>
+              <w:t xml:space="preserve"> </w:t>
+            </w:r>
+            <m:oMath>
+              <m:r>
+                <m:rPr>
+                  <m:sty m:val="p"/>
+                </m:rPr>
+                <m:t>∈</m:t>
+              </m:r>
+            </m:oMath>
+            <w:r>
+              <w:rPr>
+                <w:rtl/>
+              </w:rPr>
+              <w:t xml:space="preserve"> </w:t>
+            </w:r>
+            <w:r>
+              <w:rPr>
+                <w:rtl/>
+              </w:rPr>
+              <w:t xml:space="preserve">أو</w:t>
+            </w:r>
+            <w:r>
+              <w:rPr>
+                <w:rtl/>
+              </w:rPr>
+              <w:t xml:space="preserve"> </w:t>
+            </w:r>
+            <m:oMath>
+              <m:r>
+                <m:rPr>
+                  <m:sty m:val="p"/>
+                </m:rPr>
+                <m:t>∉</m:t>
+              </m:r>
+            </m:oMath>
+            <w:r>
+              <w:rPr>
+                <w:rtl/>
+              </w:rPr>
+              <w:t xml:space="preserve">: </w:t>
+            </w:r>
+            <w:r>
+              <w:rPr>
+                <w:rtl/>
+              </w:rPr>
+              <w:t xml:space="preserve"> </w:t>
+            </w:r>
+            <m:oMath>
+              <m:r>
+                <m:rPr>
+                  <m:sty m:val="p"/>
+                </m:rPr>
+                <m:t>−</m:t>
+              </m:r>
+              <m:r>
+                <m:t>5</m:t>
+              </m:r>
+              <m:r>
+                <m:rPr>
+                  <m:sty m:val="p"/>
+                </m:rPr>
+                <m:t>…</m:t>
+              </m:r>
+              <m:r>
+                <m:rPr>
+                  <m:sty m:val="p"/>
+                  <m:scr m:val="double-struck"/>
+                </m:rPr>
+                <m:t>N</m:t>
+              </m:r>
+            </m:oMath>
+            <w:r>
+              <w:rPr>
+                <w:rtl/>
+              </w:rPr>
+              <w:t xml:space="preserve"> </w:t>
+            </w:r>
+            <w:r>
+              <w:rPr>
+                <w:rtl/>
+              </w:rPr>
+              <w:t xml:space="preserve">؛</w:t>
+            </w:r>
+            <w:r>
+              <w:rPr>
+                <w:rtl/>
+              </w:rPr>
+              <w:t xml:space="preserve"> </w:t>
+            </w:r>
+            <m:oMath>
+              <m:f>
+                <m:fPr>
+                  <m:type m:val="bar"/>
+                </m:fPr>
+                <m:num>
+                  <m:r>
+                    <m:t>9</m:t>
+                  </m:r>
+                </m:num>
+                <m:den>
+                  <m:r>
+                    <m:t>3</m:t>
+                  </m:r>
+                </m:den>
+              </m:f>
+              <m:r>
+                <m:rPr>
+                  <m:sty m:val="p"/>
+                </m:rPr>
+                <m:t>…</m:t>
+              </m:r>
+              <m:r>
+                <m:rPr>
+                  <m:sty m:val="p"/>
+                  <m:scr m:val="double-struck"/>
+                </m:rPr>
+                <m:t>N</m:t>
+              </m:r>
+            </m:oMath>
+            <w:r>
+              <w:rPr>
+                <w:rtl/>
+              </w:rPr>
+              <w:t xml:space="preserve"> </w:t>
+            </w:r>
+            <w:r>
+              <w:rPr>
+                <w:rtl/>
+              </w:rPr>
+              <w:t xml:space="preserve">؛</w:t>
+            </w:r>
+            <w:r>
+              <w:rPr>
+                <w:rtl/>
+              </w:rPr>
+              <w:t xml:space="preserve"> </w:t>
+            </w:r>
+            <m:oMath>
+              <m:r>
+                <m:t>0</m:t>
+              </m:r>
+              <m:r>
+                <m:rPr>
+                  <m:sty m:val="p"/>
+                </m:rPr>
+                <m:t>,</m:t>
+              </m:r>
+              <m:r>
+                <m:t>3</m:t>
+              </m:r>
+              <m:r>
+                <m:rPr>
+                  <m:sty m:val="p"/>
+                </m:rPr>
+                <m:t>…</m:t>
+              </m:r>
+              <m:r>
+                <m:rPr>
+                  <m:sty m:val="p"/>
+                  <m:scr m:val="double-struck"/>
+                </m:rPr>
+                <m:t>D</m:t>
+              </m:r>
+            </m:oMath>
+            <w:r>
+              <w:rPr>
+                <w:rtl/>
+              </w:rPr>
+              <w:t xml:space="preserve"> </w:t>
+            </w:r>
+            <w:r>
+              <w:rPr>
+                <w:rtl/>
+              </w:rPr>
+              <w:t xml:space="preserve">؛</w:t>
+            </w:r>
+            <w:r>
+              <w:rPr>
+                <w:rtl/>
+              </w:rPr>
+              <w:t xml:space="preserve"> </w:t>
+            </w:r>
+            <m:oMath>
+              <m:f>
+                <m:fPr>
+                  <m:type m:val="bar"/>
+                </m:fPr>
+                <m:num>
+                  <m:r>
+                    <m:t>5</m:t>
+                  </m:r>
+                </m:num>
+                <m:den>
+                  <m:r>
+                    <m:t>6</m:t>
+                  </m:r>
+                </m:den>
+              </m:f>
+              <m:r>
+                <m:rPr>
+                  <m:sty m:val="p"/>
+                </m:rPr>
+                <m:t>…</m:t>
+              </m:r>
+              <m:r>
+                <m:rPr>
+                  <m:sty m:val="p"/>
+                  <m:scr m:val="double-struck"/>
+                </m:rPr>
+                <m:t>D</m:t>
+              </m:r>
+            </m:oMath>
+            <w:r>
+              <w:rPr>
+                <w:rtl/>
+              </w:rPr>
+              <w:t xml:space="preserve"> </w:t>
+            </w:r>
+            <w:r>
+              <w:rPr>
+                <w:rtl/>
+              </w:rPr>
+              <w:t xml:space="preserve">؛</w:t>
+            </w:r>
+            <w:r>
+              <w:rPr>
+                <w:rtl/>
+              </w:rPr>
+              <w:t xml:space="preserve"> </w:t>
+            </w:r>
+            <m:oMath>
+              <m:rad>
+                <m:radPr>
+                  <m:degHide m:val="on"/>
+                </m:radPr>
+                <m:deg/>
+                <m:e>
+                  <m:r>
+                    <m:t>25</m:t>
+                  </m:r>
+                </m:e>
+              </m:rad>
+              <m:r>
+                <m:rPr>
+                  <m:sty m:val="p"/>
+                </m:rPr>
+                <m:t>…</m:t>
+              </m:r>
+              <m:r>
+                <m:rPr>
+                  <m:sty m:val="p"/>
+                  <m:scr m:val="double-struck"/>
+                </m:rPr>
+                <m:t>Z</m:t>
+              </m:r>
+            </m:oMath>
+            <w:r>
+              <w:rPr>
+                <w:rtl/>
+              </w:rPr>
+              <w:t xml:space="preserve"> </w:t>
+            </w:r>
+            <w:r>
+              <w:rPr>
+                <w:rtl/>
+              </w:rPr>
+              <w:t xml:space="preserve">؛</w:t>
+            </w:r>
+            <w:r>
+              <w:rPr>
+                <w:rtl/>
+              </w:rPr>
+              <w:t xml:space="preserve"> </w:t>
+            </w:r>
+            <m:oMath>
+              <m:r>
+                <m:t>π</m:t>
+              </m:r>
+              <m:r>
+                <m:rPr>
+                  <m:sty m:val="p"/>
+                </m:rPr>
+                <m:t>…</m:t>
+              </m:r>
+              <m:r>
+                <m:rPr>
+                  <m:sty m:val="p"/>
+                  <m:scr m:val="double-struck"/>
+                </m:rPr>
+                <m:t>Q</m:t>
+              </m:r>
+            </m:oMath>
+            <w:r>
+              <w:rPr>
+                <w:rtl/>
+              </w:rPr>
+              <w:t xml:space="preserve">.</w:t>
+            </w:r>
+          </w:p>
+          <w:p>
+            <w:pPr>
+              <w:bidi/>
+              <w:jc w:val="left"/>
+            </w:pPr>
+            <w:r>
+              <w:rPr>
+                <w:b/>
+                <w:bCs/>
+                <w:rtl/>
+              </w:rPr>
+              <w:t xml:space="preserve">الحل:</w:t>
+            </w:r>
+            <w:r>
+              <w:rPr>
+                <w:rtl/>
+              </w:rPr>
+              <w:t xml:space="preserve"> </w:t>
+            </w:r>
+            <m:oMath>
+              <m:r>
+                <m:rPr>
+                  <m:sty m:val="p"/>
+                </m:rPr>
+                <m:t>∉</m:t>
+              </m:r>
+            </m:oMath>
+            <w:r>
+              <w:rPr>
+                <w:rtl/>
+              </w:rPr>
+              <w:t xml:space="preserve"> </w:t>
+            </w:r>
+            <w:r>
+              <w:rPr>
+                <w:rtl/>
+              </w:rPr>
+              <w:t xml:space="preserve">؛</w:t>
+            </w:r>
+            <w:r>
+              <w:rPr>
+                <w:rtl/>
+              </w:rPr>
+              <w:t xml:space="preserve"> </w:t>
+            </w:r>
+            <m:oMath>
+              <m:r>
+                <m:rPr>
+                  <m:sty m:val="p"/>
+                </m:rPr>
+                <m:t>∈</m:t>
+              </m:r>
+            </m:oMath>
+            <w:r>
+              <w:rPr>
+                <w:rtl/>
+              </w:rPr>
+              <w:t xml:space="preserve"> </w:t>
+            </w:r>
+            <w:r>
+              <w:rPr>
+                <w:rtl/>
+              </w:rPr>
+              <w:t xml:space="preserve">؛</w:t>
+            </w:r>
+            <w:r>
+              <w:rPr>
+                <w:rtl/>
+              </w:rPr>
+              <w:t xml:space="preserve"> </w:t>
+            </w:r>
+            <m:oMath>
+              <m:r>
+                <m:rPr>
+                  <m:sty m:val="p"/>
+                </m:rPr>
+                <m:t>∈</m:t>
+              </m:r>
+            </m:oMath>
+            <w:r>
+              <w:rPr>
+                <w:rtl/>
+              </w:rPr>
+              <w:t xml:space="preserve"> </w:t>
+            </w:r>
+            <w:r>
+              <w:rPr>
+                <w:rtl/>
+              </w:rPr>
+              <w:t xml:space="preserve">؛</w:t>
+            </w:r>
+            <w:r>
+              <w:rPr>
+                <w:rtl/>
+              </w:rPr>
+              <w:t xml:space="preserve"> </w:t>
+            </w:r>
+            <m:oMath>
+              <m:r>
+                <m:rPr>
+                  <m:sty m:val="p"/>
+                </m:rPr>
+                <m:t>∉</m:t>
+              </m:r>
+            </m:oMath>
+            <w:r>
+              <w:rPr>
+                <w:rtl/>
+              </w:rPr>
+              <w:t xml:space="preserve"> </w:t>
+            </w:r>
+            <w:r>
+              <w:rPr>
+                <w:rtl/>
+              </w:rPr>
+              <w:t xml:space="preserve">؛</w:t>
+            </w:r>
+            <w:r>
+              <w:rPr>
+                <w:rtl/>
+              </w:rPr>
+              <w:t xml:space="preserve"> </w:t>
+            </w:r>
+            <m:oMath>
+              <m:r>
+                <m:rPr>
+                  <m:sty m:val="p"/>
+                </m:rPr>
+                <m:t>∈</m:t>
+              </m:r>
+            </m:oMath>
+            <w:r>
+              <w:rPr>
+                <w:rtl/>
+              </w:rPr>
+              <w:t xml:space="preserve"> </w:t>
+            </w:r>
+            <w:r>
+              <w:rPr>
+                <w:rtl/>
+              </w:rPr>
+              <w:t xml:space="preserve">؛</w:t>
+            </w:r>
+            <w:r>
+              <w:rPr>
+                <w:rtl/>
+              </w:rPr>
+              <w:t xml:space="preserve"> </w:t>
+            </w:r>
+            <m:oMath>
+              <m:r>
+                <m:rPr>
+                  <m:sty m:val="p"/>
+                </m:rPr>
+                <m:t>∉</m:t>
+              </m:r>
+            </m:oMath>
+            <w:r>
+              <w:rPr>
+                <w:rtl/>
+              </w:rPr>
+              <w:t xml:space="preserve">.</w:t>
+            </w:r>
+          </w:p>
+          <w:p>
+            <w:pPr>
+              <w:bidi/>
+              <w:jc w:val="left"/>
+            </w:pPr>
+            <w:r>
+              <w:rPr>
+                <w:b/>
+                <w:bCs/>
+                <w:rtl/>
+              </w:rPr>
+              <w:t xml:space="preserve">واجب منزلي:</w:t>
+            </w:r>
+            <w:r>
+              <w:rPr>
+                <w:rtl/>
+              </w:rPr>
+              <w:t xml:space="preserve"> </w:t>
+            </w:r>
+            <w:r>
+              <w:rPr>
+                <w:rtl/>
+              </w:rPr>
+              <w:t xml:space="preserve">تمارين من الكتاب المدرسي حول مجموعات الأعداد (يختارها الأستاذ).</w:t>
+            </w:r>
+          </w:p>
+        </w:tc>
+        <w:tc>
+          <w:tcPr>
+            <w:shd w:val="clear" w:color="auto" w:fill="E4E7ED"/>
+          </w:tcPr>
+          <w:p>
+            <w:pPr>
+              <w:pStyle w:val="Compact"/>
+              <w:bidi/>
+              <w:jc w:val="left"/>
+            </w:pPr>
+            <w:r>
+              <w:rPr>
+                <w:rtl/>
+              </w:rPr>
+              <w:t xml:space="preserve"/>
+            </w:r>
+            <w:r>
+              <w:rPr>
+                <w:b/>
+                <w:bCs/>
+                <w:rtl/>
+              </w:rPr>
+              <w:t xml:space="preserve">تقويم</w:t>
+            </w:r>
+          </w:p>
+        </w:tc>
+      </w:tr>
+    </w:tbl>
     <w:sectPr>
-      <w:headerReference w:type="default" r:id="rId9"/>
-      <w:footerReference w:type="default" r:id="rId10"/>
+      <w:headerReference w:type="default" r:id="rId10"/>
+      <w:footerReference w:type="default" r:id="rId11"/>
       <w:pgSz w:h="16838" w:w="11906"/>
       <w:pgMar w:bottom="1134" w:left="964" w:right="964" w:top="1134" w:header="454" w:footer="454" w:gutter="0"/>
     </w:sectPr>
@@ -556,6 +4246,15 @@
     <w:abstractNumId w:val="991"/>
   </w:num>
   <w:num w:numId="1002">
+    <w:abstractNumId w:val="991"/>
+  </w:num>
+  <w:num w:numId="1003">
+    <w:abstractNumId w:val="991"/>
+  </w:num>
+  <w:num w:numId="1004">
+    <w:abstractNumId w:val="991"/>
+  </w:num>
+  <w:num w:numId="1005">
     <w:abstractNumId w:val="991"/>
   </w:num>
 </w:numbering>

</xml_diff>